<commit_message>
Update final JSAER docx to preserve banner table
</commit_message>
<xml_diff>
--- a/docs/ISET2026_ShadowPath_Paper_JSAER_Final.docx
+++ b/docs/ISET2026_ShadowPath_Paper_JSAER_Final.docx
@@ -547,610 +547,6 @@
         </w:tc>
       </w:tr>
     </w:tbl>
-    <w:p>
-      <w:pPr>
-        <w:pBdr>
-          <w:bottom w:val="single" w:sz="12" w:space="1" w:color="auto"/>
-        </w:pBdr>
-        <w:autoSpaceDE w:val="0"/>
-        <w:autoSpaceDN w:val="0"/>
-        <w:adjustRightInd w:val="0"/>
-        <w:spacing w:after="0" w:line="240" w:lineRule="auto"/>
-        <w:ind w:firstLine="720"/>
-        <w:jc w:val="both"/>
-        <w:rPr>
-          <w:rFonts w:ascii="Times New Roman" w:hAnsi="Times New Roman" w:cs="Times New Roman"/>
-          <w:b/>
-          <w:color w:val="000000" w:themeColor="text1"/>
-          <w:sz w:val="16"/>
-          <w:szCs w:val="16"/>
-        </w:rPr>
-      </w:pPr>
-    </w:p>
-    <w:tbl>
-      <w:tblPr>
-        <w:tblW w:w="4841" w:type="dxa"/>
-        <w:jc w:val="center"/>
-        <w:tblInd w:w="95" w:type="dxa"/>
-        <w:tblBorders>
-          <w:top w:val="single" w:sz="4" w:space="0" w:color="auto"/>
-          <w:left w:val="single" w:sz="4" w:space="0" w:color="auto"/>
-          <w:bottom w:val="single" w:sz="4" w:space="0" w:color="auto"/>
-          <w:right w:val="single" w:sz="4" w:space="0" w:color="auto"/>
-          <w:insideH w:val="single" w:sz="4" w:space="0" w:color="auto"/>
-          <w:insideV w:val="single" w:sz="4" w:space="0" w:color="auto"/>
-        </w:tblBorders>
-        <w:shd w:val="clear" w:color="auto" w:fill="FFFFFF" w:themeFill="background1"/>
-        <w:tblLook w:val="04A0"/>
-      </w:tblPr>
-      <w:tblGrid>
-        <w:gridCol w:w="600"/>
-        <w:gridCol w:w="616"/>
-        <w:gridCol w:w="687"/>
-        <w:gridCol w:w="972"/>
-        <w:gridCol w:w="1105"/>
-        <w:gridCol w:w="861"/>
-      </w:tblGrid>
-      <w:tr>
-        <w:trPr>
-          <w:trHeight w:val="300"/>
-          <w:jc w:val="center"/>
-        </w:trPr>
-        <w:tc>
-          <w:tcPr>
-            <w:tcW w:w="600" w:type="dxa"/>
-            <w:shd w:val="clear" w:color="auto" w:fill="FFFFFF" w:themeFill="background1"/>
-            <w:noWrap/>
-            <w:vAlign w:val="bottom"/>
-            <w:hideMark/>
-          </w:tcPr>
-          <w:p>
-            <w:pPr>
-              <w:spacing w:after="0" w:line="240" w:lineRule="auto"/>
-              <w:rPr>
-                <w:rFonts w:ascii="Times New Roman" w:eastAsia="Times New Roman" w:hAnsi="Times New Roman" w:cs="Times New Roman"/>
-                <w:b/>
-                <w:bCs/>
-                <w:sz w:val="20"/>
-                <w:szCs w:val="20"/>
-              </w:rPr>
-            </w:pPr>
-            <w:r>
-              <w:rPr>
-                <w:rFonts w:ascii="Times New Roman" w:eastAsia="Times New Roman" w:hAnsi="Times New Roman" w:cs="Times New Roman"/>
-                <w:b/>
-                <w:bCs/>
-                <w:sz w:val="20"/>
-                <w:szCs w:val="20"/>
-              </w:rPr>
-              <w:t>N</w:t>
-            </w:r>
-            <w:r>
-              <w:rPr>
-                <w:rFonts w:ascii="Times New Roman" w:eastAsia="Times New Roman" w:hAnsi="Times New Roman" w:cs="Times New Roman"/>
-                <w:b/>
-                <w:bCs/>
-                <w:sz w:val="20"/>
-                <w:szCs w:val="20"/>
-              </w:rPr>
-              <w:t>f</w:t>
-            </w:r>
-          </w:p>
-        </w:tc>
-        <w:tc>
-          <w:tcPr>
-            <w:tcW w:w="616" w:type="dxa"/>
-            <w:shd w:val="clear" w:color="auto" w:fill="FFFFFF" w:themeFill="background1"/>
-            <w:noWrap/>
-            <w:vAlign w:val="bottom"/>
-            <w:hideMark/>
-          </w:tcPr>
-          <w:p>
-            <w:pPr>
-              <w:spacing w:after="0" w:line="240" w:lineRule="auto"/>
-              <w:rPr>
-                <w:rFonts w:ascii="Times New Roman" w:eastAsia="Times New Roman" w:hAnsi="Times New Roman" w:cs="Times New Roman"/>
-                <w:b/>
-                <w:bCs/>
-                <w:sz w:val="20"/>
-                <w:szCs w:val="20"/>
-              </w:rPr>
-            </w:pPr>
-            <w:r>
-              <w:rPr>
-                <w:rFonts w:ascii="Times New Roman" w:eastAsia="Times New Roman" w:hAnsi="Times New Roman" w:cs="Times New Roman"/>
-                <w:b/>
-                <w:bCs/>
-                <w:sz w:val="20"/>
-                <w:szCs w:val="20"/>
-              </w:rPr>
-              <w:t>Rt</w:t>
-            </w:r>
-          </w:p>
-        </w:tc>
-        <w:tc>
-          <w:tcPr>
-            <w:tcW w:w="687" w:type="dxa"/>
-            <w:shd w:val="clear" w:color="auto" w:fill="FFFFFF" w:themeFill="background1"/>
-            <w:noWrap/>
-            <w:vAlign w:val="bottom"/>
-            <w:hideMark/>
-          </w:tcPr>
-          <w:p>
-            <w:pPr>
-              <w:spacing w:after="0" w:line="240" w:lineRule="auto"/>
-              <w:rPr>
-                <w:rFonts w:ascii="Times New Roman" w:eastAsia="Times New Roman" w:hAnsi="Times New Roman" w:cs="Times New Roman"/>
-                <w:b/>
-                <w:bCs/>
-                <w:sz w:val="20"/>
-                <w:szCs w:val="20"/>
-              </w:rPr>
-            </w:pPr>
-            <w:r>
-              <w:rPr>
-                <w:rFonts w:ascii="Times New Roman" w:eastAsia="Times New Roman" w:hAnsi="Times New Roman" w:cs="Times New Roman"/>
-                <w:b/>
-                <w:bCs/>
-                <w:sz w:val="20"/>
-                <w:szCs w:val="20"/>
-              </w:rPr>
-              <w:t>Aw</w:t>
-            </w:r>
-          </w:p>
-        </w:tc>
-        <w:tc>
-          <w:tcPr>
-            <w:tcW w:w="972" w:type="dxa"/>
-            <w:shd w:val="clear" w:color="auto" w:fill="FFFFFF" w:themeFill="background1"/>
-            <w:noWrap/>
-            <w:vAlign w:val="bottom"/>
-            <w:hideMark/>
-          </w:tcPr>
-          <w:p>
-            <w:pPr>
-              <w:spacing w:after="0" w:line="240" w:lineRule="auto"/>
-              <w:rPr>
-                <w:rFonts w:ascii="Times New Roman" w:eastAsia="Times New Roman" w:hAnsi="Times New Roman" w:cs="Times New Roman"/>
-                <w:b/>
-                <w:bCs/>
-                <w:sz w:val="20"/>
-                <w:szCs w:val="20"/>
-              </w:rPr>
-            </w:pPr>
-            <w:r>
-              <w:rPr>
-                <w:rFonts w:ascii="Times New Roman" w:eastAsia="Times New Roman" w:hAnsi="Times New Roman" w:cs="Times New Roman"/>
-                <w:b/>
-                <w:bCs/>
-                <w:sz w:val="20"/>
-                <w:szCs w:val="20"/>
-              </w:rPr>
-              <w:t>Cd*1000</w:t>
-            </w:r>
-          </w:p>
-        </w:tc>
-        <w:tc>
-          <w:tcPr>
-            <w:tcW w:w="1105" w:type="dxa"/>
-            <w:shd w:val="clear" w:color="auto" w:fill="FFFFFF" w:themeFill="background1"/>
-            <w:noWrap/>
-            <w:vAlign w:val="bottom"/>
-            <w:hideMark/>
-          </w:tcPr>
-          <w:p>
-            <w:pPr>
-              <w:spacing w:after="0" w:line="240" w:lineRule="auto"/>
-              <w:rPr>
-                <w:rFonts w:ascii="Times New Roman" w:eastAsia="Times New Roman" w:hAnsi="Times New Roman" w:cs="Times New Roman"/>
-                <w:b/>
-                <w:bCs/>
-                <w:sz w:val="20"/>
-                <w:szCs w:val="20"/>
-              </w:rPr>
-            </w:pPr>
-            <w:r>
-              <w:rPr>
-                <w:rFonts w:ascii="Times New Roman" w:eastAsia="Times New Roman" w:hAnsi="Times New Roman" w:cs="Times New Roman"/>
-                <w:b/>
-                <w:bCs/>
-                <w:sz w:val="20"/>
-                <w:szCs w:val="20"/>
-              </w:rPr>
-              <w:t>V/(Cd*10)</w:t>
-            </w:r>
-          </w:p>
-        </w:tc>
-        <w:tc>
-          <w:tcPr>
-            <w:tcW w:w="861" w:type="dxa"/>
-            <w:shd w:val="clear" w:color="auto" w:fill="FFFFFF" w:themeFill="background1"/>
-            <w:noWrap/>
-            <w:vAlign w:val="bottom"/>
-            <w:hideMark/>
-          </w:tcPr>
-          <w:p>
-            <w:pPr>
-              <w:spacing w:after="0" w:line="240" w:lineRule="auto"/>
-              <w:rPr>
-                <w:rFonts w:ascii="Times New Roman" w:eastAsia="Times New Roman" w:hAnsi="Times New Roman" w:cs="Times New Roman"/>
-                <w:b/>
-                <w:bCs/>
-                <w:sz w:val="20"/>
-                <w:szCs w:val="20"/>
-              </w:rPr>
-            </w:pPr>
-            <w:r>
-              <w:rPr>
-                <w:rFonts w:ascii="Times New Roman" w:eastAsia="Times New Roman" w:hAnsi="Times New Roman" w:cs="Times New Roman"/>
-                <w:b/>
-                <w:bCs/>
-                <w:sz w:val="20"/>
-                <w:szCs w:val="20"/>
-              </w:rPr>
-              <w:t>Cv*100</w:t>
-            </w:r>
-          </w:p>
-        </w:tc>
-      </w:tr>
-      <w:tr>
-        <w:trPr>
-          <w:trHeight w:val="152"/>
-          <w:jc w:val="center"/>
-        </w:trPr>
-        <w:tc>
-          <w:tcPr>
-            <w:tcW w:w="600" w:type="dxa"/>
-            <w:shd w:val="clear" w:color="auto" w:fill="FFFFFF" w:themeFill="background1"/>
-            <w:noWrap/>
-            <w:vAlign w:val="bottom"/>
-            <w:hideMark/>
-          </w:tcPr>
-          <w:p>
-            <w:pPr>
-              <w:spacing w:after="0" w:line="240" w:lineRule="auto"/>
-              <w:rPr>
-                <w:rFonts w:ascii="Times New Roman" w:eastAsia="Times New Roman" w:hAnsi="Times New Roman" w:cs="Times New Roman"/>
-                <w:b/>
-                <w:bCs/>
-                <w:sz w:val="20"/>
-                <w:szCs w:val="20"/>
-              </w:rPr>
-            </w:pPr>
-            <w:r>
-              <w:rPr>
-                <w:rFonts w:ascii="Times New Roman" w:eastAsia="Times New Roman" w:hAnsi="Times New Roman" w:cs="Times New Roman"/>
-                <w:b/>
-                <w:bCs/>
-                <w:sz w:val="20"/>
-                <w:szCs w:val="20"/>
-              </w:rPr>
-              <w:t>1</w:t>
-            </w:r>
-          </w:p>
-        </w:tc>
-        <w:tc>
-          <w:tcPr>
-            <w:tcW w:w="616" w:type="dxa"/>
-            <w:shd w:val="clear" w:color="auto" w:fill="FFFFFF" w:themeFill="background1"/>
-            <w:noWrap/>
-            <w:vAlign w:val="bottom"/>
-            <w:hideMark/>
-          </w:tcPr>
-          <w:p>
-            <w:pPr>
-              <w:spacing w:after="0" w:line="240" w:lineRule="auto"/>
-              <w:rPr>
-                <w:rFonts w:ascii="Times New Roman" w:eastAsia="Times New Roman" w:hAnsi="Times New Roman" w:cs="Times New Roman"/>
-                <w:sz w:val="20"/>
-                <w:szCs w:val="20"/>
-              </w:rPr>
-            </w:pPr>
-            <w:r>
-              <w:rPr>
-                <w:rFonts w:ascii="Times New Roman" w:eastAsia="Times New Roman" w:hAnsi="Times New Roman" w:cs="Times New Roman"/>
-                <w:sz w:val="20"/>
-                <w:szCs w:val="20"/>
-              </w:rPr>
-              <w:t>1944</w:t>
-            </w:r>
-          </w:p>
-        </w:tc>
-        <w:tc>
-          <w:tcPr>
-            <w:tcW w:w="687" w:type="dxa"/>
-            <w:shd w:val="clear" w:color="auto" w:fill="FFFFFF" w:themeFill="background1"/>
-            <w:noWrap/>
-            <w:vAlign w:val="bottom"/>
-            <w:hideMark/>
-          </w:tcPr>
-          <w:p>
-            <w:pPr>
-              <w:spacing w:after="0" w:line="240" w:lineRule="auto"/>
-              <w:rPr>
-                <w:rFonts w:ascii="Times New Roman" w:eastAsia="Times New Roman" w:hAnsi="Times New Roman" w:cs="Times New Roman"/>
-                <w:sz w:val="20"/>
-                <w:szCs w:val="20"/>
-              </w:rPr>
-            </w:pPr>
-            <w:r>
-              <w:rPr>
-                <w:rFonts w:ascii="Times New Roman" w:eastAsia="Times New Roman" w:hAnsi="Times New Roman" w:cs="Times New Roman"/>
-                <w:sz w:val="20"/>
-                <w:szCs w:val="20"/>
-              </w:rPr>
-              <w:t>11.16</w:t>
-            </w:r>
-          </w:p>
-        </w:tc>
-        <w:tc>
-          <w:tcPr>
-            <w:tcW w:w="972" w:type="dxa"/>
-            <w:shd w:val="clear" w:color="auto" w:fill="FFFFFF" w:themeFill="background1"/>
-            <w:noWrap/>
-            <w:vAlign w:val="bottom"/>
-            <w:hideMark/>
-          </w:tcPr>
-          <w:p>
-            <w:pPr>
-              <w:spacing w:after="0" w:line="240" w:lineRule="auto"/>
-              <w:rPr>
-                <w:rFonts w:ascii="Times New Roman" w:eastAsia="Times New Roman" w:hAnsi="Times New Roman" w:cs="Times New Roman"/>
-                <w:sz w:val="20"/>
-                <w:szCs w:val="20"/>
-              </w:rPr>
-            </w:pPr>
-            <w:r>
-              <w:rPr>
-                <w:rFonts w:ascii="Times New Roman" w:eastAsia="Times New Roman" w:hAnsi="Times New Roman" w:cs="Times New Roman"/>
-                <w:sz w:val="20"/>
-                <w:szCs w:val="20"/>
-              </w:rPr>
-              <w:t>3.484</w:t>
-            </w:r>
-          </w:p>
-        </w:tc>
-        <w:tc>
-          <w:tcPr>
-            <w:tcW w:w="1105" w:type="dxa"/>
-            <w:shd w:val="clear" w:color="auto" w:fill="FFFFFF" w:themeFill="background1"/>
-            <w:noWrap/>
-            <w:vAlign w:val="bottom"/>
-            <w:hideMark/>
-          </w:tcPr>
-          <w:p>
-            <w:pPr>
-              <w:spacing w:after="0" w:line="240" w:lineRule="auto"/>
-              <w:rPr>
-                <w:rFonts w:ascii="Times New Roman" w:eastAsia="Times New Roman" w:hAnsi="Times New Roman" w:cs="Times New Roman"/>
-                <w:sz w:val="20"/>
-                <w:szCs w:val="20"/>
-              </w:rPr>
-            </w:pPr>
-            <w:r>
-              <w:rPr>
-                <w:rFonts w:ascii="Times New Roman" w:eastAsia="Times New Roman" w:hAnsi="Times New Roman" w:cs="Times New Roman"/>
-                <w:sz w:val="20"/>
-                <w:szCs w:val="20"/>
-              </w:rPr>
-              <w:t>59.99</w:t>
-            </w:r>
-          </w:p>
-        </w:tc>
-        <w:tc>
-          <w:tcPr>
-            <w:tcW w:w="861" w:type="dxa"/>
-            <w:shd w:val="clear" w:color="auto" w:fill="FFFFFF" w:themeFill="background1"/>
-            <w:noWrap/>
-            <w:vAlign w:val="bottom"/>
-            <w:hideMark/>
-          </w:tcPr>
-          <w:p>
-            <w:pPr>
-              <w:spacing w:after="0" w:line="240" w:lineRule="auto"/>
-              <w:rPr>
-                <w:rFonts w:ascii="Times New Roman" w:eastAsia="Times New Roman" w:hAnsi="Times New Roman" w:cs="Times New Roman"/>
-                <w:sz w:val="20"/>
-                <w:szCs w:val="20"/>
-              </w:rPr>
-            </w:pPr>
-            <w:r>
-              <w:rPr>
-                <w:rFonts w:ascii="Times New Roman" w:eastAsia="Times New Roman" w:hAnsi="Times New Roman" w:cs="Times New Roman"/>
-                <w:sz w:val="20"/>
-                <w:szCs w:val="20"/>
-              </w:rPr>
-              <w:t>2.38</w:t>
-            </w:r>
-          </w:p>
-        </w:tc>
-      </w:tr>
-      <w:tr>
-        <w:trPr>
-          <w:trHeight w:val="89"/>
-          <w:jc w:val="center"/>
-        </w:trPr>
-        <w:tc>
-          <w:tcPr>
-            <w:tcW w:w="600" w:type="dxa"/>
-            <w:shd w:val="clear" w:color="auto" w:fill="FFFFFF" w:themeFill="background1"/>
-            <w:noWrap/>
-            <w:vAlign w:val="bottom"/>
-            <w:hideMark/>
-          </w:tcPr>
-          <w:p>
-            <w:pPr>
-              <w:spacing w:after="0" w:line="240" w:lineRule="auto"/>
-              <w:rPr>
-                <w:rFonts w:ascii="Times New Roman" w:eastAsia="Times New Roman" w:hAnsi="Times New Roman" w:cs="Times New Roman"/>
-                <w:b/>
-                <w:bCs/>
-                <w:sz w:val="20"/>
-                <w:szCs w:val="20"/>
-              </w:rPr>
-            </w:pPr>
-            <w:r>
-              <w:rPr>
-                <w:rFonts w:ascii="Times New Roman" w:eastAsia="Times New Roman" w:hAnsi="Times New Roman" w:cs="Times New Roman"/>
-                <w:b/>
-                <w:bCs/>
-                <w:sz w:val="20"/>
-                <w:szCs w:val="20"/>
-              </w:rPr>
-              <w:t>1.15</w:t>
-            </w:r>
-          </w:p>
-        </w:tc>
-        <w:tc>
-          <w:tcPr>
-            <w:tcW w:w="616" w:type="dxa"/>
-            <w:shd w:val="clear" w:color="auto" w:fill="FFFFFF" w:themeFill="background1"/>
-            <w:noWrap/>
-            <w:vAlign w:val="bottom"/>
-            <w:hideMark/>
-          </w:tcPr>
-          <w:p>
-            <w:pPr>
-              <w:spacing w:after="0" w:line="240" w:lineRule="auto"/>
-              <w:rPr>
-                <w:rFonts w:ascii="Times New Roman" w:eastAsia="Times New Roman" w:hAnsi="Times New Roman" w:cs="Times New Roman"/>
-                <w:sz w:val="20"/>
-                <w:szCs w:val="20"/>
-              </w:rPr>
-            </w:pPr>
-            <w:r>
-              <w:rPr>
-                <w:rFonts w:ascii="Times New Roman" w:eastAsia="Times New Roman" w:hAnsi="Times New Roman" w:cs="Times New Roman"/>
-                <w:sz w:val="20"/>
-                <w:szCs w:val="20"/>
-              </w:rPr>
-              <w:t>1820</w:t>
-            </w:r>
-          </w:p>
-        </w:tc>
-        <w:tc>
-          <w:tcPr>
-            <w:tcW w:w="687" w:type="dxa"/>
-            <w:shd w:val="clear" w:color="auto" w:fill="FFFFFF" w:themeFill="background1"/>
-            <w:noWrap/>
-            <w:vAlign w:val="bottom"/>
-            <w:hideMark/>
-          </w:tcPr>
-          <w:p>
-            <w:pPr>
-              <w:spacing w:after="0" w:line="240" w:lineRule="auto"/>
-              <w:rPr>
-                <w:rFonts w:ascii="Times New Roman" w:eastAsia="Times New Roman" w:hAnsi="Times New Roman" w:cs="Times New Roman"/>
-                <w:sz w:val="20"/>
-                <w:szCs w:val="20"/>
-              </w:rPr>
-            </w:pPr>
-            <w:r>
-              <w:rPr>
-                <w:rFonts w:ascii="Times New Roman" w:eastAsia="Times New Roman" w:hAnsi="Times New Roman" w:cs="Times New Roman"/>
-                <w:sz w:val="20"/>
-                <w:szCs w:val="20"/>
-              </w:rPr>
-              <w:t>11.79</w:t>
-            </w:r>
-          </w:p>
-        </w:tc>
-        <w:tc>
-          <w:tcPr>
-            <w:tcW w:w="972" w:type="dxa"/>
-            <w:shd w:val="clear" w:color="auto" w:fill="FFFFFF" w:themeFill="background1"/>
-            <w:noWrap/>
-            <w:vAlign w:val="bottom"/>
-            <w:hideMark/>
-          </w:tcPr>
-          <w:p>
-            <w:pPr>
-              <w:spacing w:after="0" w:line="240" w:lineRule="auto"/>
-              <w:rPr>
-                <w:rFonts w:ascii="Times New Roman" w:eastAsia="Times New Roman" w:hAnsi="Times New Roman" w:cs="Times New Roman"/>
-                <w:sz w:val="20"/>
-                <w:szCs w:val="20"/>
-              </w:rPr>
-            </w:pPr>
-            <w:r>
-              <w:rPr>
-                <w:rFonts w:ascii="Times New Roman" w:eastAsia="Times New Roman" w:hAnsi="Times New Roman" w:cs="Times New Roman"/>
-                <w:sz w:val="20"/>
-                <w:szCs w:val="20"/>
-              </w:rPr>
-              <w:t>3.087</w:t>
-            </w:r>
-          </w:p>
-        </w:tc>
-        <w:tc>
-          <w:tcPr>
-            <w:tcW w:w="1105" w:type="dxa"/>
-            <w:shd w:val="clear" w:color="auto" w:fill="FFFFFF" w:themeFill="background1"/>
-            <w:noWrap/>
-            <w:vAlign w:val="bottom"/>
-            <w:hideMark/>
-          </w:tcPr>
-          <w:p>
-            <w:pPr>
-              <w:spacing w:after="0" w:line="240" w:lineRule="auto"/>
-              <w:rPr>
-                <w:rFonts w:ascii="Times New Roman" w:eastAsia="Times New Roman" w:hAnsi="Times New Roman" w:cs="Times New Roman"/>
-                <w:sz w:val="20"/>
-                <w:szCs w:val="20"/>
-              </w:rPr>
-            </w:pPr>
-            <w:r>
-              <w:rPr>
-                <w:rFonts w:ascii="Times New Roman" w:eastAsia="Times New Roman" w:hAnsi="Times New Roman" w:cs="Times New Roman"/>
-                <w:sz w:val="20"/>
-                <w:szCs w:val="20"/>
-              </w:rPr>
-              <w:t>73.20</w:t>
-            </w:r>
-          </w:p>
-        </w:tc>
-        <w:tc>
-          <w:tcPr>
-            <w:tcW w:w="861" w:type="dxa"/>
-            <w:shd w:val="clear" w:color="auto" w:fill="FFFFFF" w:themeFill="background1"/>
-            <w:noWrap/>
-            <w:vAlign w:val="bottom"/>
-            <w:hideMark/>
-          </w:tcPr>
-          <w:p>
-            <w:pPr>
-              <w:spacing w:after="0" w:line="240" w:lineRule="auto"/>
-              <w:rPr>
-                <w:rFonts w:ascii="Times New Roman" w:eastAsia="Times New Roman" w:hAnsi="Times New Roman" w:cs="Times New Roman"/>
-                <w:sz w:val="20"/>
-                <w:szCs w:val="20"/>
-              </w:rPr>
-            </w:pPr>
-            <w:r>
-              <w:rPr>
-                <w:rFonts w:ascii="Times New Roman" w:eastAsia="Times New Roman" w:hAnsi="Times New Roman" w:cs="Times New Roman"/>
-                <w:sz w:val="20"/>
-                <w:szCs w:val="20"/>
-              </w:rPr>
-              <w:t>2.11</w:t>
-            </w:r>
-          </w:p>
-        </w:tc>
-      </w:tr>
-    </w:tbl>
-    <w:sectPr>
-      <w:headerReference w:type="even" r:id="rId12"/>
-      <w:headerReference w:type="default" r:id="rId13"/>
-      <w:footerReference w:type="even" r:id="rId14"/>
-      <w:footerReference w:type="default" r:id="rId15"/>
-      <w:footerReference w:type="first" r:id="rId16"/>
-      <w:pgSz w:w="11906" w:h="16838"/>
-      <w:pgMar w:top="1440" w:right="1440" w:bottom="1440" w:left="1440" w:header="708" w:footer="708" w:gutter="0"/>
-      <w:pgNumType w:start="1"/>
-      <w:cols w:space="708"/>
-      <w:titlePg/>
-      <w:docGrid w:linePitch="360"/>
-    </w:sectPr>
     <w:bookmarkStart w:id="51" w:name="X57e0f86ae6da9ac8c4dabe597902d09ea095b17"/>
     <w:p>
       <w:pPr>
@@ -5272,13 +4668,13 @@
     <w:bookmarkEnd w:id="50"/>
     <w:bookmarkEnd w:id="51"/>
     <w:sectPr>
-      <w:headerReference r:id="rId12" w:type="even"/>
-      <w:headerReference r:id="rId13" w:type="default"/>
-      <w:footerReference r:id="rId14" w:type="even"/>
-      <w:footerReference r:id="rId15" w:type="default"/>
-      <w:footerReference r:id="rId16" w:type="first"/>
-      <w:pgSz w:h="16838" w:w="11906"/>
-      <w:pgMar w:bottom="1440" w:footer="708" w:gutter="0" w:header="708" w:left="1440" w:right="1440" w:top="1440"/>
+      <w:headerReference w:type="even" r:id="rId12"/>
+      <w:headerReference w:type="default" r:id="rId13"/>
+      <w:footerReference w:type="even" r:id="rId14"/>
+      <w:footerReference w:type="default" r:id="rId15"/>
+      <w:footerReference w:type="first" r:id="rId16"/>
+      <w:pgSz w:w="11906" w:h="16838"/>
+      <w:pgMar w:top="1440" w:right="1440" w:bottom="1440" w:left="1440" w:header="708" w:footer="708" w:gutter="0"/>
       <w:pgNumType w:start="1"/>
       <w:cols w:space="708"/>
       <w:titlePg/>

</xml_diff>

<commit_message>
Fix justification gaps and font size collisions
</commit_message>
<xml_diff>
--- a/docs/ISET2026_ShadowPath_Paper_JSAER_Final.docx
+++ b/docs/ISET2026_ShadowPath_Paper_JSAER_Final.docx
@@ -552,7 +552,7 @@
       <w:pPr>
         <w:pStyle w:val="Heading1"/>
         <w:spacing w:before="0" w:after="0" w:line="240" w:lineRule="auto"/>
-        <w:jc w:val="both"/>
+        <w:jc w:val="center"/>
       </w:pPr>
       <w:r>
         <w:rPr>
@@ -566,7 +566,7 @@
     <w:p>
       <w:pPr>
         <w:spacing w:before="0" w:after="0" w:line="240" w:lineRule="auto"/>
-        <w:jc w:val="both"/>
+        <w:jc w:val="left"/>
       </w:pPr>
       <w:r>
         <w:rPr>
@@ -582,7 +582,7 @@
       <w:pPr>
         <w:pStyle w:val="FirstParagraph"/>
         <w:spacing w:before="0" w:after="0" w:line="240" w:lineRule="auto"/>
-        <w:jc w:val="both"/>
+        <w:jc w:val="left"/>
       </w:pPr>
       <w:r>
         <w:rPr>
@@ -598,12 +598,11 @@
       <w:pPr>
         <w:pStyle w:val="BodyText"/>
         <w:spacing w:before="0" w:after="0" w:line="240" w:lineRule="auto"/>
-        <w:jc w:val="both"/>
-      </w:pPr>
-      <w:r>
-        <w:rPr>
-          <w:rFonts w:ascii="Times New Roman" w:hAnsi="Times New Roman"/>
-          <w:b w:val="0"/>
+        <w:jc w:val="left"/>
+      </w:pPr>
+      <w:r>
+        <w:rPr>
+          <w:rFonts w:ascii="Times New Roman" w:hAnsi="Times New Roman"/>
           <w:sz w:val="22"/>
         </w:rPr>
         <w:t xml:space="preserve">¹˒²</w:t>
@@ -611,7 +610,6 @@
       <w:r>
         <w:rPr>
           <w:rFonts w:ascii="Times New Roman" w:hAnsi="Times New Roman"/>
-          <w:b w:val="0"/>
           <w:sz w:val="22"/>
         </w:rPr>
         <w:t xml:space="preserve"> </w:t>
@@ -619,8 +617,6 @@
       <w:r>
         <w:rPr>
           <w:rFonts w:ascii="Times New Roman" w:hAnsi="Times New Roman"/>
-          <w:b w:val="0"/>
-          <w:i/>
           <w:iCs/>
           <w:sz w:val="22"/>
         </w:rPr>
@@ -629,7 +625,6 @@
       <w:r>
         <w:rPr>
           <w:rFonts w:ascii="Times New Roman" w:hAnsi="Times New Roman"/>
-          <w:b w:val="0"/>
           <w:sz w:val="22"/>
         </w:rPr>
         <w:br/>
@@ -637,8 +632,6 @@
       <w:r>
         <w:rPr>
           <w:rFonts w:ascii="Times New Roman" w:hAnsi="Times New Roman"/>
-          <w:b w:val="0"/>
-          <w:i/>
           <w:iCs/>
           <w:sz w:val="22"/>
         </w:rPr>
@@ -647,7 +640,6 @@
       <w:r>
         <w:rPr>
           <w:rFonts w:ascii="Times New Roman" w:hAnsi="Times New Roman"/>
-          <w:b w:val="0"/>
           <w:sz w:val="22"/>
         </w:rPr>
         <w:br/>
@@ -655,8 +647,6 @@
       <w:r>
         <w:rPr>
           <w:rFonts w:ascii="Times New Roman" w:hAnsi="Times New Roman"/>
-          <w:b w:val="0"/>
-          <w:i/>
           <w:iCs/>
           <w:sz w:val="22"/>
         </w:rPr>
@@ -665,7 +655,6 @@
       <w:r>
         <w:rPr>
           <w:rFonts w:ascii="Times New Roman" w:hAnsi="Times New Roman"/>
-          <w:b w:val="0"/>
           <w:sz w:val="22"/>
         </w:rPr>
         <w:br/>
@@ -673,7 +662,6 @@
       <w:r>
         <w:rPr>
           <w:rFonts w:ascii="Times New Roman" w:hAnsi="Times New Roman"/>
-          <w:b w:val="0"/>
           <w:sz w:val="22"/>
         </w:rPr>
         <w:t xml:space="preserve">malapati.cvv241195@cvv.ac.in (corresponding author)</w:t>
@@ -682,7 +670,7 @@
     <w:p>
       <w:pPr>
         <w:spacing w:before="0" w:after="0" w:line="240" w:lineRule="auto"/>
-        <w:jc w:val="both"/>
+        <w:jc w:val="left"/>
       </w:pPr>
       <w:r>
         <w:rPr>
@@ -698,13 +686,11 @@
       <w:pPr>
         <w:pStyle w:val="BlockText"/>
         <w:spacing w:before="0" w:after="0" w:line="240" w:lineRule="auto"/>
-        <w:jc w:val="both"/>
-      </w:pPr>
-      <w:r>
-        <w:rPr>
-          <w:rFonts w:ascii="Times New Roman" w:hAnsi="Times New Roman"/>
-          <w:b w:val="0"/>
-          <w:i/>
+        <w:jc w:val="left"/>
+      </w:pPr>
+      <w:r>
+        <w:rPr>
+          <w:rFonts w:ascii="Times New Roman" w:hAnsi="Times New Roman"/>
           <w:iCs/>
           <w:sz w:val="22"/>
         </w:rPr>
@@ -713,7 +699,6 @@
       <w:r>
         <w:rPr>
           <w:rFonts w:ascii="Times New Roman" w:hAnsi="Times New Roman"/>
-          <w:b w:val="0"/>
           <w:sz w:val="22"/>
         </w:rPr>
         <w:br/>
@@ -721,8 +706,6 @@
       <w:r>
         <w:rPr>
           <w:rFonts w:ascii="Times New Roman" w:hAnsi="Times New Roman"/>
-          <w:b w:val="0"/>
-          <w:i/>
           <w:iCs/>
           <w:sz w:val="22"/>
         </w:rPr>
@@ -731,7 +714,6 @@
       <w:r>
         <w:rPr>
           <w:rFonts w:ascii="Times New Roman" w:hAnsi="Times New Roman"/>
-          <w:b w:val="0"/>
           <w:sz w:val="22"/>
         </w:rPr>
         <w:br/>
@@ -739,8 +721,6 @@
       <w:r>
         <w:rPr>
           <w:rFonts w:ascii="Times New Roman" w:hAnsi="Times New Roman"/>
-          <w:b w:val="0"/>
-          <w:i/>
           <w:iCs/>
           <w:sz w:val="22"/>
         </w:rPr>
@@ -750,7 +730,7 @@
     <w:p>
       <w:pPr>
         <w:spacing w:before="0" w:after="0" w:line="240" w:lineRule="auto"/>
-        <w:jc w:val="both"/>
+        <w:jc w:val="left"/>
       </w:pPr>
       <w:r>
         <w:rPr>
@@ -767,7 +747,7 @@
       <w:pPr>
         <w:pStyle w:val="Heading2"/>
         <w:spacing w:before="0" w:after="0" w:line="240" w:lineRule="auto"/>
-        <w:jc w:val="both"/>
+        <w:jc w:val="left"/>
       </w:pPr>
       <w:r>
         <w:rPr>
@@ -781,7 +761,7 @@
       <w:pPr>
         <w:pStyle w:val="FirstParagraph"/>
         <w:spacing w:before="0" w:after="0" w:line="240" w:lineRule="auto"/>
-        <w:jc w:val="both"/>
+        <w:jc w:val="left"/>
       </w:pPr>
       <w:r>
         <w:rPr>
@@ -800,7 +780,6 @@
       <w:r>
         <w:rPr>
           <w:rFonts w:ascii="Times New Roman" w:hAnsi="Times New Roman"/>
-          <w:b/>
           <w:bCs/>
           <w:sz w:val="20"/>
         </w:rPr>
@@ -846,12 +825,11 @@
       <w:pPr>
         <w:pStyle w:val="BodyText"/>
         <w:spacing w:before="0" w:after="0" w:line="240" w:lineRule="auto"/>
-        <w:jc w:val="both"/>
-      </w:pPr>
-      <w:r>
-        <w:rPr>
-          <w:rFonts w:ascii="Times New Roman" w:hAnsi="Times New Roman"/>
-          <w:b/>
+        <w:jc w:val="left"/>
+      </w:pPr>
+      <w:r>
+        <w:rPr>
+          <w:rFonts w:ascii="Times New Roman" w:hAnsi="Times New Roman"/>
           <w:bCs/>
           <w:sz w:val="20"/>
         </w:rPr>
@@ -875,7 +853,7 @@
     <w:p>
       <w:pPr>
         <w:spacing w:before="0" w:after="0" w:line="240" w:lineRule="auto"/>
-        <w:jc w:val="both"/>
+        <w:jc w:val="left"/>
       </w:pPr>
       <w:r>
         <w:rPr>
@@ -893,7 +871,7 @@
       <w:pPr>
         <w:pStyle w:val="Heading2"/>
         <w:spacing w:before="0" w:after="0" w:line="240" w:lineRule="auto"/>
-        <w:jc w:val="both"/>
+        <w:jc w:val="left"/>
       </w:pPr>
       <w:r>
         <w:rPr>
@@ -908,7 +886,7 @@
       <w:pPr>
         <w:pStyle w:val="FirstParagraph"/>
         <w:spacing w:before="0" w:after="0" w:line="240" w:lineRule="auto"/>
-        <w:jc w:val="both"/>
+        <w:jc w:val="left"/>
       </w:pPr>
       <w:r>
         <w:rPr>
@@ -922,7 +900,7 @@
       <w:pPr>
         <w:pStyle w:val="BodyText"/>
         <w:spacing w:before="0" w:after="0" w:line="240" w:lineRule="auto"/>
-        <w:jc w:val="both"/>
+        <w:jc w:val="left"/>
       </w:pPr>
       <w:r>
         <w:rPr>
@@ -936,12 +914,11 @@
       <w:pPr>
         <w:pStyle w:val="BodyText"/>
         <w:spacing w:before="0" w:after="0" w:line="240" w:lineRule="auto"/>
-        <w:jc w:val="both"/>
-      </w:pPr>
-      <w:r>
-        <w:rPr>
-          <w:rFonts w:ascii="Times New Roman" w:hAnsi="Times New Roman"/>
-          <w:b/>
+        <w:jc w:val="left"/>
+      </w:pPr>
+      <w:r>
+        <w:rPr>
+          <w:rFonts w:ascii="Times New Roman" w:hAnsi="Times New Roman"/>
           <w:bCs/>
           <w:sz w:val="20"/>
         </w:rPr>
@@ -966,7 +943,7 @@
       <w:pPr>
         <w:pStyle w:val="BodyText"/>
         <w:spacing w:before="0" w:after="0" w:line="240" w:lineRule="auto"/>
-        <w:jc w:val="both"/>
+        <w:jc w:val="left"/>
       </w:pPr>
       <w:r>
         <w:rPr>
@@ -980,7 +957,7 @@
       <w:pPr>
         <w:pStyle w:val="BodyText"/>
         <w:spacing w:before="0" w:after="0" w:line="240" w:lineRule="auto"/>
-        <w:jc w:val="both"/>
+        <w:jc w:val="left"/>
       </w:pPr>
       <w:r>
         <w:rPr>
@@ -993,7 +970,7 @@
     <w:p>
       <w:pPr>
         <w:spacing w:before="0" w:after="0" w:line="240" w:lineRule="auto"/>
-        <w:jc w:val="both"/>
+        <w:jc w:val="left"/>
       </w:pPr>
       <w:r>
         <w:rPr>
@@ -1011,7 +988,7 @@
       <w:pPr>
         <w:pStyle w:val="Heading2"/>
         <w:spacing w:before="0" w:after="0" w:line="240" w:lineRule="auto"/>
-        <w:jc w:val="both"/>
+        <w:jc w:val="left"/>
       </w:pPr>
       <w:r>
         <w:rPr>
@@ -1026,7 +1003,7 @@
       <w:pPr>
         <w:pStyle w:val="FirstParagraph"/>
         <w:spacing w:before="0" w:after="0" w:line="240" w:lineRule="auto"/>
-        <w:jc w:val="both"/>
+        <w:jc w:val="left"/>
       </w:pPr>
       <w:r>
         <w:rPr>
@@ -1045,7 +1022,6 @@
       <w:r>
         <w:rPr>
           <w:rFonts w:ascii="Times New Roman" w:hAnsi="Times New Roman"/>
-          <w:i/>
           <w:iCs/>
           <w:sz w:val="20"/>
         </w:rPr>
@@ -1075,7 +1051,6 @@
       <w:r>
         <w:rPr>
           <w:rFonts w:ascii="Times New Roman" w:hAnsi="Times New Roman"/>
-          <w:i/>
           <w:iCs/>
           <w:sz w:val="20"/>
         </w:rPr>
@@ -1086,7 +1061,7 @@
       <w:pPr>
         <w:pStyle w:val="BodyText"/>
         <w:spacing w:before="0" w:after="0" w:line="240" w:lineRule="auto"/>
-        <w:jc w:val="both"/>
+        <w:jc w:val="left"/>
       </w:pPr>
       <w:r>
         <w:rPr>
@@ -1100,7 +1075,7 @@
       <w:pPr>
         <w:pStyle w:val="BodyText"/>
         <w:spacing w:before="0" w:after="0" w:line="240" w:lineRule="auto"/>
-        <w:jc w:val="both"/>
+        <w:jc w:val="left"/>
       </w:pPr>
       <w:r>
         <w:rPr>
@@ -1114,7 +1089,7 @@
       <w:pPr>
         <w:pStyle w:val="BodyText"/>
         <w:spacing w:before="0" w:after="0" w:line="240" w:lineRule="auto"/>
-        <w:jc w:val="both"/>
+        <w:jc w:val="left"/>
       </w:pPr>
       <w:r>
         <w:rPr>
@@ -1133,7 +1108,6 @@
       <w:r>
         <w:rPr>
           <w:rFonts w:ascii="Times New Roman" w:hAnsi="Times New Roman"/>
-          <w:i/>
           <w:iCs/>
           <w:sz w:val="20"/>
         </w:rPr>
@@ -1143,7 +1117,7 @@
     <w:p>
       <w:pPr>
         <w:spacing w:before="0" w:after="0" w:line="240" w:lineRule="auto"/>
-        <w:jc w:val="both"/>
+        <w:jc w:val="left"/>
       </w:pPr>
       <w:r>
         <w:rPr>
@@ -1161,7 +1135,7 @@
       <w:pPr>
         <w:pStyle w:val="Heading2"/>
         <w:spacing w:before="0" w:after="0" w:line="240" w:lineRule="auto"/>
-        <w:jc w:val="both"/>
+        <w:jc w:val="left"/>
       </w:pPr>
       <w:r>
         <w:rPr>
@@ -1176,7 +1150,7 @@
       <w:pPr>
         <w:pStyle w:val="FirstParagraph"/>
         <w:spacing w:before="0" w:after="0" w:line="240" w:lineRule="auto"/>
-        <w:jc w:val="both"/>
+        <w:jc w:val="left"/>
       </w:pPr>
       <w:r>
         <w:rPr>
@@ -1194,7 +1168,7 @@
           <w:numId w:val="1001"/>
         </w:numPr>
         <w:spacing w:before="0" w:after="0" w:line="240" w:lineRule="auto"/>
-        <w:jc w:val="both"/>
+        <w:jc w:val="left"/>
       </w:pPr>
       <w:r>
         <w:rPr>
@@ -1212,7 +1186,7 @@
           <w:numId w:val="1001"/>
         </w:numPr>
         <w:spacing w:before="0" w:after="0" w:line="240" w:lineRule="auto"/>
-        <w:jc w:val="both"/>
+        <w:jc w:val="left"/>
       </w:pPr>
       <w:r>
         <w:rPr>
@@ -1230,7 +1204,7 @@
           <w:numId w:val="1001"/>
         </w:numPr>
         <w:spacing w:before="0" w:after="0" w:line="240" w:lineRule="auto"/>
-        <w:jc w:val="both"/>
+        <w:jc w:val="left"/>
       </w:pPr>
       <w:r>
         <w:rPr>
@@ -1248,7 +1222,7 @@
           <w:numId w:val="1001"/>
         </w:numPr>
         <w:spacing w:before="0" w:after="0" w:line="240" w:lineRule="auto"/>
-        <w:jc w:val="both"/>
+        <w:jc w:val="left"/>
       </w:pPr>
       <w:r>
         <w:rPr>
@@ -1266,7 +1240,7 @@
           <w:numId w:val="1001"/>
         </w:numPr>
         <w:spacing w:before="0" w:after="0" w:line="240" w:lineRule="auto"/>
-        <w:jc w:val="both"/>
+        <w:jc w:val="left"/>
       </w:pPr>
       <w:r>
         <w:rPr>
@@ -1284,7 +1258,7 @@
           <w:numId w:val="1001"/>
         </w:numPr>
         <w:spacing w:before="0" w:after="0" w:line="240" w:lineRule="auto"/>
-        <w:jc w:val="both"/>
+        <w:jc w:val="left"/>
       </w:pPr>
       <w:r>
         <w:rPr>
@@ -1302,7 +1276,7 @@
           <w:numId w:val="1001"/>
         </w:numPr>
         <w:spacing w:before="0" w:after="0" w:line="240" w:lineRule="auto"/>
-        <w:jc w:val="both"/>
+        <w:jc w:val="left"/>
       </w:pPr>
       <w:r>
         <w:rPr>
@@ -1315,7 +1289,7 @@
     <w:p>
       <w:pPr>
         <w:spacing w:before="0" w:after="0" w:line="240" w:lineRule="auto"/>
-        <w:jc w:val="both"/>
+        <w:jc w:val="left"/>
       </w:pPr>
       <w:r>
         <w:rPr>
@@ -1333,7 +1307,7 @@
       <w:pPr>
         <w:pStyle w:val="Heading2"/>
         <w:spacing w:before="0" w:after="0" w:line="240" w:lineRule="auto"/>
-        <w:jc w:val="both"/>
+        <w:jc w:val="left"/>
       </w:pPr>
       <w:r>
         <w:rPr>
@@ -1349,7 +1323,7 @@
       <w:pPr>
         <w:pStyle w:val="Heading3"/>
         <w:spacing w:before="0" w:after="0" w:line="240" w:lineRule="auto"/>
-        <w:jc w:val="both"/>
+        <w:jc w:val="left"/>
       </w:pPr>
       <w:r>
         <w:rPr>
@@ -1364,7 +1338,7 @@
       <w:pPr>
         <w:pStyle w:val="FirstParagraph"/>
         <w:spacing w:before="0" w:after="0" w:line="240" w:lineRule="auto"/>
-        <w:jc w:val="both"/>
+        <w:jc w:val="left"/>
       </w:pPr>
       <w:r>
         <w:rPr>
@@ -1581,7 +1555,7 @@
       <w:pPr>
         <w:pStyle w:val="BodyText"/>
         <w:spacing w:before="0" w:after="0" w:line="240" w:lineRule="auto"/>
-        <w:jc w:val="both"/>
+        <w:jc w:val="left"/>
       </w:pPr>
       <w:r>
         <w:rPr>
@@ -1597,7 +1571,7 @@
       <w:pPr>
         <w:pStyle w:val="Heading3"/>
         <w:spacing w:before="0" w:after="0" w:line="240" w:lineRule="auto"/>
-        <w:jc w:val="both"/>
+        <w:jc w:val="left"/>
       </w:pPr>
       <w:r>
         <w:rPr>
@@ -1612,7 +1586,7 @@
       <w:pPr>
         <w:pStyle w:val="FirstParagraph"/>
         <w:spacing w:before="0" w:after="0" w:line="240" w:lineRule="auto"/>
-        <w:jc w:val="both"/>
+        <w:jc w:val="left"/>
       </w:pPr>
       <w:r>
         <w:rPr>
@@ -1626,7 +1600,7 @@
       <w:pPr>
         <w:pStyle w:val="BodyText"/>
         <w:spacing w:before="0" w:after="0" w:line="240" w:lineRule="auto"/>
-        <w:jc w:val="both"/>
+        <w:jc w:val="left"/>
       </w:pPr>
       <w:r>
         <w:rPr>
@@ -1642,7 +1616,7 @@
       <w:pPr>
         <w:pStyle w:val="Heading3"/>
         <w:spacing w:before="0" w:after="0" w:line="240" w:lineRule="auto"/>
-        <w:jc w:val="both"/>
+        <w:jc w:val="left"/>
       </w:pPr>
       <w:r>
         <w:rPr>
@@ -1657,7 +1631,7 @@
       <w:pPr>
         <w:pStyle w:val="FirstParagraph"/>
         <w:spacing w:before="0" w:after="0" w:line="240" w:lineRule="auto"/>
-        <w:jc w:val="both"/>
+        <w:jc w:val="left"/>
       </w:pPr>
       <w:r>
         <w:rPr>
@@ -1673,7 +1647,7 @@
       <w:pPr>
         <w:pStyle w:val="Heading3"/>
         <w:spacing w:before="0" w:after="0" w:line="240" w:lineRule="auto"/>
-        <w:jc w:val="both"/>
+        <w:jc w:val="left"/>
       </w:pPr>
       <w:r>
         <w:rPr>
@@ -1688,7 +1662,7 @@
       <w:pPr>
         <w:pStyle w:val="FirstParagraph"/>
         <w:spacing w:before="0" w:after="0" w:line="240" w:lineRule="auto"/>
-        <w:jc w:val="both"/>
+        <w:jc w:val="left"/>
       </w:pPr>
       <w:r>
         <w:rPr>
@@ -1701,7 +1675,7 @@
     <w:p>
       <w:pPr>
         <w:spacing w:before="0" w:after="0" w:line="240" w:lineRule="auto"/>
-        <w:jc w:val="both"/>
+        <w:jc w:val="left"/>
       </w:pPr>
       <w:r>
         <w:rPr>
@@ -1720,7 +1694,7 @@
       <w:pPr>
         <w:pStyle w:val="Heading2"/>
         <w:spacing w:before="0" w:after="0" w:line="240" w:lineRule="auto"/>
-        <w:jc w:val="both"/>
+        <w:jc w:val="left"/>
       </w:pPr>
       <w:r>
         <w:rPr>
@@ -1735,7 +1709,7 @@
       <w:pPr>
         <w:pStyle w:val="FirstParagraph"/>
         <w:spacing w:before="0" w:after="0" w:line="240" w:lineRule="auto"/>
-        <w:jc w:val="both"/>
+        <w:jc w:val="left"/>
       </w:pPr>
       <w:r>
         <w:rPr>
@@ -1749,7 +1723,7 @@
       <w:pPr>
         <w:pStyle w:val="BodyText"/>
         <w:spacing w:before="0" w:after="0" w:line="240" w:lineRule="auto"/>
-        <w:jc w:val="both"/>
+        <w:jc w:val="left"/>
       </w:pPr>
       <w:r>
         <w:rPr>
@@ -1768,7 +1742,6 @@
       <w:r>
         <w:rPr>
           <w:rFonts w:ascii="Times New Roman" w:hAnsi="Times New Roman"/>
-          <w:i/>
           <w:iCs/>
           <w:sz w:val="20"/>
         </w:rPr>
@@ -1784,7 +1757,6 @@
       <w:r>
         <w:rPr>
           <w:rFonts w:ascii="Times New Roman" w:hAnsi="Times New Roman"/>
-          <w:i/>
           <w:iCs/>
           <w:sz w:val="20"/>
         </w:rPr>
@@ -1814,7 +1786,6 @@
       <w:r>
         <w:rPr>
           <w:rFonts w:ascii="Times New Roman" w:hAnsi="Times New Roman"/>
-          <w:i/>
           <w:iCs/>
           <w:sz w:val="20"/>
         </w:rPr>
@@ -1838,7 +1809,7 @@
     <w:p>
       <w:pPr>
         <w:spacing w:before="0" w:after="0" w:line="240" w:lineRule="auto"/>
-        <w:jc w:val="both"/>
+        <w:jc w:val="left"/>
       </w:pPr>
       <w:r>
         <w:rPr>
@@ -1856,7 +1827,7 @@
       <w:pPr>
         <w:pStyle w:val="Heading2"/>
         <w:spacing w:before="0" w:after="0" w:line="240" w:lineRule="auto"/>
-        <w:jc w:val="both"/>
+        <w:jc w:val="left"/>
       </w:pPr>
       <w:r>
         <w:rPr>
@@ -1871,7 +1842,7 @@
       <w:pPr>
         <w:pStyle w:val="FirstParagraph"/>
         <w:spacing w:before="0" w:after="0" w:line="240" w:lineRule="auto"/>
-        <w:jc w:val="both"/>
+        <w:jc w:val="left"/>
       </w:pPr>
       <w:r>
         <w:rPr>
@@ -1885,7 +1856,7 @@
       <w:pPr>
         <w:pStyle w:val="SourceCode"/>
         <w:spacing w:before="0" w:after="0" w:line="240" w:lineRule="auto"/>
-        <w:jc w:val="both"/>
+        <w:jc w:val="left"/>
       </w:pPr>
       <w:r>
         <w:rPr>
@@ -2275,12 +2246,11 @@
       <w:pPr>
         <w:pStyle w:val="FirstParagraph"/>
         <w:spacing w:before="0" w:after="0" w:line="240" w:lineRule="auto"/>
-        <w:jc w:val="both"/>
-      </w:pPr>
-      <w:r>
-        <w:rPr>
-          <w:rFonts w:ascii="Times New Roman" w:hAnsi="Times New Roman"/>
-          <w:b/>
+        <w:jc w:val="left"/>
+      </w:pPr>
+      <w:r>
+        <w:rPr>
+          <w:rFonts w:ascii="Times New Roman" w:hAnsi="Times New Roman"/>
           <w:bCs/>
           <w:sz w:val="20"/>
         </w:rPr>
@@ -2305,12 +2275,11 @@
       <w:pPr>
         <w:pStyle w:val="BodyText"/>
         <w:spacing w:before="0" w:after="0" w:line="240" w:lineRule="auto"/>
-        <w:jc w:val="both"/>
-      </w:pPr>
-      <w:r>
-        <w:rPr>
-          <w:rFonts w:ascii="Times New Roman" w:hAnsi="Times New Roman"/>
-          <w:b/>
+        <w:jc w:val="left"/>
+      </w:pPr>
+      <w:r>
+        <w:rPr>
+          <w:rFonts w:ascii="Times New Roman" w:hAnsi="Times New Roman"/>
           <w:bCs/>
           <w:sz w:val="20"/>
         </w:rPr>
@@ -2356,12 +2325,11 @@
       <w:pPr>
         <w:pStyle w:val="BodyText"/>
         <w:spacing w:before="0" w:after="0" w:line="240" w:lineRule="auto"/>
-        <w:jc w:val="both"/>
-      </w:pPr>
-      <w:r>
-        <w:rPr>
-          <w:rFonts w:ascii="Times New Roman" w:hAnsi="Times New Roman"/>
-          <w:b/>
+        <w:jc w:val="left"/>
+      </w:pPr>
+      <w:r>
+        <w:rPr>
+          <w:rFonts w:ascii="Times New Roman" w:hAnsi="Times New Roman"/>
           <w:bCs/>
           <w:sz w:val="20"/>
         </w:rPr>
@@ -2386,12 +2354,11 @@
       <w:pPr>
         <w:pStyle w:val="BodyText"/>
         <w:spacing w:before="0" w:after="0" w:line="240" w:lineRule="auto"/>
-        <w:jc w:val="both"/>
-      </w:pPr>
-      <w:r>
-        <w:rPr>
-          <w:rFonts w:ascii="Times New Roman" w:hAnsi="Times New Roman"/>
-          <w:b/>
+        <w:jc w:val="left"/>
+      </w:pPr>
+      <w:r>
+        <w:rPr>
+          <w:rFonts w:ascii="Times New Roman" w:hAnsi="Times New Roman"/>
           <w:bCs/>
           <w:sz w:val="20"/>
         </w:rPr>
@@ -2416,12 +2383,11 @@
       <w:pPr>
         <w:pStyle w:val="BodyText"/>
         <w:spacing w:before="0" w:after="0" w:line="240" w:lineRule="auto"/>
-        <w:jc w:val="both"/>
-      </w:pPr>
-      <w:r>
-        <w:rPr>
-          <w:rFonts w:ascii="Times New Roman" w:hAnsi="Times New Roman"/>
-          <w:b/>
+        <w:jc w:val="left"/>
+      </w:pPr>
+      <w:r>
+        <w:rPr>
+          <w:rFonts w:ascii="Times New Roman" w:hAnsi="Times New Roman"/>
           <w:bCs/>
           <w:sz w:val="20"/>
         </w:rPr>
@@ -2446,12 +2412,11 @@
       <w:pPr>
         <w:pStyle w:val="BodyText"/>
         <w:spacing w:before="0" w:after="0" w:line="240" w:lineRule="auto"/>
-        <w:jc w:val="both"/>
-      </w:pPr>
-      <w:r>
-        <w:rPr>
-          <w:rFonts w:ascii="Times New Roman" w:hAnsi="Times New Roman"/>
-          <w:b/>
+        <w:jc w:val="left"/>
+      </w:pPr>
+      <w:r>
+        <w:rPr>
+          <w:rFonts w:ascii="Times New Roman" w:hAnsi="Times New Roman"/>
           <w:bCs/>
           <w:sz w:val="20"/>
         </w:rPr>
@@ -2475,7 +2440,7 @@
     <w:p>
       <w:pPr>
         <w:spacing w:before="0" w:after="0" w:line="240" w:lineRule="auto"/>
-        <w:jc w:val="both"/>
+        <w:jc w:val="left"/>
       </w:pPr>
       <w:r>
         <w:rPr>
@@ -2493,7 +2458,7 @@
       <w:pPr>
         <w:pStyle w:val="Heading2"/>
         <w:spacing w:before="0" w:after="0" w:line="240" w:lineRule="auto"/>
-        <w:jc w:val="both"/>
+        <w:jc w:val="left"/>
       </w:pPr>
       <w:r>
         <w:rPr>
@@ -2508,7 +2473,7 @@
       <w:pPr>
         <w:pStyle w:val="FirstParagraph"/>
         <w:spacing w:before="0" w:after="0" w:line="240" w:lineRule="auto"/>
-        <w:jc w:val="both"/>
+        <w:jc w:val="left"/>
       </w:pPr>
       <w:r>
         <w:rPr>
@@ -2522,12 +2487,11 @@
       <w:pPr>
         <w:pStyle w:val="BodyText"/>
         <w:spacing w:before="0" w:after="0" w:line="240" w:lineRule="auto"/>
-        <w:jc w:val="both"/>
-      </w:pPr>
-      <w:r>
-        <w:rPr>
-          <w:rFonts w:ascii="Times New Roman" w:hAnsi="Times New Roman"/>
-          <w:b/>
+        <w:jc w:val="left"/>
+      </w:pPr>
+      <w:r>
+        <w:rPr>
+          <w:rFonts w:ascii="Times New Roman" w:hAnsi="Times New Roman"/>
           <w:bCs/>
           <w:sz w:val="20"/>
         </w:rPr>
@@ -2779,7 +2743,7 @@
       <w:pPr>
         <w:pStyle w:val="BodyText"/>
         <w:spacing w:before="0" w:after="0" w:line="240" w:lineRule="auto"/>
-        <w:jc w:val="both"/>
+        <w:jc w:val="left"/>
       </w:pPr>
       <w:r>
         <w:rPr>
@@ -2792,7 +2756,7 @@
     <w:p>
       <w:pPr>
         <w:spacing w:before="0" w:after="0" w:line="240" w:lineRule="auto"/>
-        <w:jc w:val="both"/>
+        <w:jc w:val="left"/>
       </w:pPr>
       <w:r>
         <w:rPr>
@@ -2810,7 +2774,7 @@
       <w:pPr>
         <w:pStyle w:val="Heading2"/>
         <w:spacing w:before="0" w:after="0" w:line="240" w:lineRule="auto"/>
-        <w:jc w:val="both"/>
+        <w:jc w:val="left"/>
       </w:pPr>
       <w:r>
         <w:rPr>
@@ -2825,7 +2789,7 @@
       <w:pPr>
         <w:pStyle w:val="FirstParagraph"/>
         <w:spacing w:before="0" w:after="0" w:line="240" w:lineRule="auto"/>
-        <w:jc w:val="both"/>
+        <w:jc w:val="left"/>
       </w:pPr>
       <w:r>
         <w:rPr>
@@ -2839,12 +2803,11 @@
       <w:pPr>
         <w:pStyle w:val="BodyText"/>
         <w:spacing w:before="0" w:after="0" w:line="240" w:lineRule="auto"/>
-        <w:jc w:val="both"/>
-      </w:pPr>
-      <w:r>
-        <w:rPr>
-          <w:rFonts w:ascii="Times New Roman" w:hAnsi="Times New Roman"/>
-          <w:b/>
+        <w:jc w:val="left"/>
+      </w:pPr>
+      <w:r>
+        <w:rPr>
+          <w:rFonts w:ascii="Times New Roman" w:hAnsi="Times New Roman"/>
           <w:bCs/>
           <w:sz w:val="20"/>
         </w:rPr>
@@ -2869,12 +2832,11 @@
       <w:pPr>
         <w:pStyle w:val="BodyText"/>
         <w:spacing w:before="0" w:after="0" w:line="240" w:lineRule="auto"/>
-        <w:jc w:val="both"/>
-      </w:pPr>
-      <w:r>
-        <w:rPr>
-          <w:rFonts w:ascii="Times New Roman" w:hAnsi="Times New Roman"/>
-          <w:b/>
+        <w:jc w:val="left"/>
+      </w:pPr>
+      <w:r>
+        <w:rPr>
+          <w:rFonts w:ascii="Times New Roman" w:hAnsi="Times New Roman"/>
           <w:bCs/>
           <w:sz w:val="20"/>
         </w:rPr>
@@ -2899,12 +2861,11 @@
       <w:pPr>
         <w:pStyle w:val="BodyText"/>
         <w:spacing w:before="0" w:after="0" w:line="240" w:lineRule="auto"/>
-        <w:jc w:val="both"/>
-      </w:pPr>
-      <w:r>
-        <w:rPr>
-          <w:rFonts w:ascii="Times New Roman" w:hAnsi="Times New Roman"/>
-          <w:b/>
+        <w:jc w:val="left"/>
+      </w:pPr>
+      <w:r>
+        <w:rPr>
+          <w:rFonts w:ascii="Times New Roman" w:hAnsi="Times New Roman"/>
           <w:bCs/>
           <w:sz w:val="20"/>
         </w:rPr>
@@ -2929,12 +2890,11 @@
       <w:pPr>
         <w:pStyle w:val="BodyText"/>
         <w:spacing w:before="0" w:after="0" w:line="240" w:lineRule="auto"/>
-        <w:jc w:val="both"/>
-      </w:pPr>
-      <w:r>
-        <w:rPr>
-          <w:rFonts w:ascii="Times New Roman" w:hAnsi="Times New Roman"/>
-          <w:b/>
+        <w:jc w:val="left"/>
+      </w:pPr>
+      <w:r>
+        <w:rPr>
+          <w:rFonts w:ascii="Times New Roman" w:hAnsi="Times New Roman"/>
           <w:bCs/>
           <w:sz w:val="20"/>
         </w:rPr>
@@ -2978,7 +2938,6 @@
       <w:r>
         <w:rPr>
           <w:rFonts w:ascii="Times New Roman" w:hAnsi="Times New Roman"/>
-          <w:b/>
           <w:bCs/>
           <w:sz w:val="20"/>
         </w:rPr>
@@ -3022,7 +2981,6 @@
       <w:r>
         <w:rPr>
           <w:rFonts w:ascii="Times New Roman" w:hAnsi="Times New Roman"/>
-          <w:b/>
           <w:bCs/>
           <w:sz w:val="20"/>
         </w:rPr>
@@ -3066,7 +3024,6 @@
       <w:r>
         <w:rPr>
           <w:rFonts w:ascii="Times New Roman" w:hAnsi="Times New Roman"/>
-          <w:b/>
           <w:bCs/>
           <w:sz w:val="20"/>
         </w:rPr>
@@ -3110,7 +3067,6 @@
       <w:r>
         <w:rPr>
           <w:rFonts w:ascii="Times New Roman" w:hAnsi="Times New Roman"/>
-          <w:b/>
           <w:bCs/>
           <w:sz w:val="20"/>
         </w:rPr>
@@ -3183,7 +3139,6 @@
       <w:r>
         <w:rPr>
           <w:rFonts w:ascii="Times New Roman" w:hAnsi="Times New Roman"/>
-          <w:b/>
           <w:bCs/>
           <w:sz w:val="20"/>
         </w:rPr>
@@ -3227,7 +3182,6 @@
       <w:r>
         <w:rPr>
           <w:rFonts w:ascii="Times New Roman" w:hAnsi="Times New Roman"/>
-          <w:b/>
           <w:bCs/>
           <w:sz w:val="20"/>
         </w:rPr>
@@ -3271,7 +3225,6 @@
       <w:r>
         <w:rPr>
           <w:rFonts w:ascii="Times New Roman" w:hAnsi="Times New Roman"/>
-          <w:b/>
           <w:bCs/>
           <w:sz w:val="20"/>
         </w:rPr>
@@ -3296,12 +3249,11 @@
       <w:pPr>
         <w:pStyle w:val="BodyText"/>
         <w:spacing w:before="0" w:after="0" w:line="240" w:lineRule="auto"/>
-        <w:jc w:val="both"/>
-      </w:pPr>
-      <w:r>
-        <w:rPr>
-          <w:rFonts w:ascii="Times New Roman" w:hAnsi="Times New Roman"/>
-          <w:b/>
+        <w:jc w:val="left"/>
+      </w:pPr>
+      <w:r>
+        <w:rPr>
+          <w:rFonts w:ascii="Times New Roman" w:hAnsi="Times New Roman"/>
           <w:bCs/>
           <w:sz w:val="20"/>
         </w:rPr>
@@ -3326,12 +3278,11 @@
       <w:pPr>
         <w:pStyle w:val="BodyText"/>
         <w:spacing w:before="0" w:after="0" w:line="240" w:lineRule="auto"/>
-        <w:jc w:val="both"/>
-      </w:pPr>
-      <w:r>
-        <w:rPr>
-          <w:rFonts w:ascii="Times New Roman" w:hAnsi="Times New Roman"/>
-          <w:b/>
+        <w:jc w:val="left"/>
+      </w:pPr>
+      <w:r>
+        <w:rPr>
+          <w:rFonts w:ascii="Times New Roman" w:hAnsi="Times New Roman"/>
           <w:bCs/>
           <w:sz w:val="20"/>
         </w:rPr>
@@ -3361,7 +3312,6 @@
       <w:r>
         <w:rPr>
           <w:rFonts w:ascii="Times New Roman" w:hAnsi="Times New Roman"/>
-          <w:i/>
           <w:iCs/>
           <w:sz w:val="20"/>
         </w:rPr>
@@ -3385,7 +3335,7 @@
     <w:p>
       <w:pPr>
         <w:spacing w:before="0" w:after="0" w:line="240" w:lineRule="auto"/>
-        <w:jc w:val="both"/>
+        <w:jc w:val="left"/>
       </w:pPr>
       <w:r>
         <w:rPr>
@@ -3403,7 +3353,7 @@
       <w:pPr>
         <w:pStyle w:val="Heading2"/>
         <w:spacing w:before="0" w:after="0" w:line="240" w:lineRule="auto"/>
-        <w:jc w:val="both"/>
+        <w:jc w:val="left"/>
       </w:pPr>
       <w:r>
         <w:rPr>
@@ -3419,7 +3369,7 @@
       <w:pPr>
         <w:pStyle w:val="Heading3"/>
         <w:spacing w:before="0" w:after="0" w:line="240" w:lineRule="auto"/>
-        <w:jc w:val="both"/>
+        <w:jc w:val="left"/>
       </w:pPr>
       <w:r>
         <w:rPr>
@@ -3434,7 +3384,7 @@
       <w:pPr>
         <w:pStyle w:val="FirstParagraph"/>
         <w:spacing w:before="0" w:after="0" w:line="240" w:lineRule="auto"/>
-        <w:jc w:val="both"/>
+        <w:jc w:val="left"/>
       </w:pPr>
       <w:r>
         <w:rPr>
@@ -3453,7 +3403,6 @@
       <w:r>
         <w:rPr>
           <w:rFonts w:ascii="Times New Roman" w:hAnsi="Times New Roman"/>
-          <w:i/>
           <w:iCs/>
           <w:sz w:val="20"/>
         </w:rPr>
@@ -3483,7 +3432,6 @@
       <w:r>
         <w:rPr>
           <w:rFonts w:ascii="Times New Roman" w:hAnsi="Times New Roman"/>
-          <w:i/>
           <w:iCs/>
           <w:sz w:val="20"/>
         </w:rPr>
@@ -3508,12 +3456,11 @@
       <w:pPr>
         <w:pStyle w:val="BodyText"/>
         <w:spacing w:before="0" w:after="0" w:line="240" w:lineRule="auto"/>
-        <w:jc w:val="both"/>
-      </w:pPr>
-      <w:r>
-        <w:rPr>
-          <w:rFonts w:ascii="Times New Roman" w:hAnsi="Times New Roman"/>
-          <w:b/>
+        <w:jc w:val="left"/>
+      </w:pPr>
+      <w:r>
+        <w:rPr>
+          <w:rFonts w:ascii="Times New Roman" w:hAnsi="Times New Roman"/>
           <w:bCs/>
           <w:sz w:val="20"/>
         </w:rPr>
@@ -3524,12 +3471,11 @@
       <w:pPr>
         <w:pStyle w:val="BlockText"/>
         <w:spacing w:before="0" w:after="0" w:line="240" w:lineRule="auto"/>
-        <w:jc w:val="both"/>
-      </w:pPr>
-      <w:r>
-        <w:rPr>
-          <w:rFonts w:ascii="Times New Roman" w:hAnsi="Times New Roman"/>
-          <w:i/>
+        <w:jc w:val="left"/>
+      </w:pPr>
+      <w:r>
+        <w:rPr>
+          <w:rFonts w:ascii="Times New Roman" w:hAnsi="Times New Roman"/>
           <w:iCs/>
           <w:sz w:val="20"/>
         </w:rPr>
@@ -3545,7 +3491,6 @@
       <w:r>
         <w:rPr>
           <w:rFonts w:ascii="Times New Roman" w:hAnsi="Times New Roman"/>
-          <w:i/>
           <w:iCs/>
           <w:sz w:val="20"/>
         </w:rPr>
@@ -3568,7 +3513,6 @@
       <w:r>
         <w:rPr>
           <w:rFonts w:ascii="Times New Roman" w:hAnsi="Times New Roman"/>
-          <w:i/>
           <w:iCs/>
           <w:sz w:val="20"/>
         </w:rPr>
@@ -3584,7 +3528,6 @@
       <w:r>
         <w:rPr>
           <w:rFonts w:ascii="Times New Roman" w:hAnsi="Times New Roman"/>
-          <w:i/>
           <w:iCs/>
           <w:sz w:val="20"/>
         </w:rPr>
@@ -3607,7 +3550,6 @@
       <w:r>
         <w:rPr>
           <w:rFonts w:ascii="Times New Roman" w:hAnsi="Times New Roman"/>
-          <w:i/>
           <w:iCs/>
           <w:sz w:val="20"/>
         </w:rPr>
@@ -3623,7 +3565,6 @@
       <w:r>
         <w:rPr>
           <w:rFonts w:ascii="Times New Roman" w:hAnsi="Times New Roman"/>
-          <w:i/>
           <w:iCs/>
           <w:sz w:val="20"/>
         </w:rPr>
@@ -3646,7 +3587,6 @@
       <w:r>
         <w:rPr>
           <w:rFonts w:ascii="Times New Roman" w:hAnsi="Times New Roman"/>
-          <w:i/>
           <w:iCs/>
           <w:sz w:val="20"/>
         </w:rPr>
@@ -3662,7 +3602,6 @@
       <w:r>
         <w:rPr>
           <w:rFonts w:ascii="Times New Roman" w:hAnsi="Times New Roman"/>
-          <w:i/>
           <w:iCs/>
           <w:sz w:val="20"/>
         </w:rPr>
@@ -3685,7 +3624,6 @@
       <w:r>
         <w:rPr>
           <w:rFonts w:ascii="Times New Roman" w:hAnsi="Times New Roman"/>
-          <w:i/>
           <w:iCs/>
           <w:sz w:val="20"/>
         </w:rPr>
@@ -3701,7 +3639,6 @@
       <w:r>
         <w:rPr>
           <w:rFonts w:ascii="Times New Roman" w:hAnsi="Times New Roman"/>
-          <w:i/>
           <w:iCs/>
           <w:sz w:val="20"/>
         </w:rPr>
@@ -3724,7 +3661,6 @@
       <w:r>
         <w:rPr>
           <w:rFonts w:ascii="Times New Roman" w:hAnsi="Times New Roman"/>
-          <w:i/>
           <w:iCs/>
           <w:sz w:val="20"/>
         </w:rPr>
@@ -3740,7 +3676,6 @@
       <w:r>
         <w:rPr>
           <w:rFonts w:ascii="Times New Roman" w:hAnsi="Times New Roman"/>
-          <w:i/>
           <w:iCs/>
           <w:sz w:val="20"/>
         </w:rPr>
@@ -3763,7 +3698,6 @@
       <w:r>
         <w:rPr>
           <w:rFonts w:ascii="Times New Roman" w:hAnsi="Times New Roman"/>
-          <w:i/>
           <w:iCs/>
           <w:sz w:val="20"/>
         </w:rPr>
@@ -3779,7 +3713,6 @@
       <w:r>
         <w:rPr>
           <w:rFonts w:ascii="Times New Roman" w:hAnsi="Times New Roman"/>
-          <w:i/>
           <w:iCs/>
           <w:sz w:val="20"/>
         </w:rPr>
@@ -3797,12 +3730,11 @@
       <w:pPr>
         <w:pStyle w:val="FirstParagraph"/>
         <w:spacing w:before="0" w:after="0" w:line="240" w:lineRule="auto"/>
-        <w:jc w:val="both"/>
-      </w:pPr>
-      <w:r>
-        <w:rPr>
-          <w:rFonts w:ascii="Times New Roman" w:hAnsi="Times New Roman"/>
-          <w:b/>
+        <w:jc w:val="left"/>
+      </w:pPr>
+      <w:r>
+        <w:rPr>
+          <w:rFonts w:ascii="Times New Roman" w:hAnsi="Times New Roman"/>
           <w:bCs/>
           <w:sz w:val="20"/>
         </w:rPr>
@@ -4098,12 +4030,11 @@
       <w:pPr>
         <w:pStyle w:val="BodyText"/>
         <w:spacing w:before="0" w:after="0" w:line="240" w:lineRule="auto"/>
-        <w:jc w:val="both"/>
-      </w:pPr>
-      <w:r>
-        <w:rPr>
-          <w:rFonts w:ascii="Times New Roman" w:hAnsi="Times New Roman"/>
-          <w:b/>
+        <w:jc w:val="left"/>
+      </w:pPr>
+      <w:r>
+        <w:rPr>
+          <w:rFonts w:ascii="Times New Roman" w:hAnsi="Times New Roman"/>
           <w:bCs/>
           <w:sz w:val="20"/>
         </w:rPr>
@@ -4119,7 +4050,6 @@
       <w:r>
         <w:rPr>
           <w:rFonts w:ascii="Times New Roman" w:hAnsi="Times New Roman"/>
-          <w:i/>
           <w:iCs/>
           <w:sz w:val="20"/>
         </w:rPr>
@@ -4144,12 +4074,11 @@
       <w:pPr>
         <w:pStyle w:val="BodyText"/>
         <w:spacing w:before="0" w:after="0" w:line="240" w:lineRule="auto"/>
-        <w:jc w:val="both"/>
-      </w:pPr>
-      <w:r>
-        <w:rPr>
-          <w:rFonts w:ascii="Times New Roman" w:hAnsi="Times New Roman"/>
-          <w:b/>
+        <w:jc w:val="left"/>
+      </w:pPr>
+      <w:r>
+        <w:rPr>
+          <w:rFonts w:ascii="Times New Roman" w:hAnsi="Times New Roman"/>
           <w:bCs/>
           <w:sz w:val="20"/>
         </w:rPr>
@@ -4165,7 +4094,6 @@
       <w:r>
         <w:rPr>
           <w:rFonts w:ascii="Times New Roman" w:hAnsi="Times New Roman"/>
-          <w:i/>
           <w:iCs/>
           <w:sz w:val="20"/>
         </w:rPr>
@@ -4190,12 +4118,11 @@
       <w:pPr>
         <w:pStyle w:val="BodyText"/>
         <w:spacing w:before="0" w:after="0" w:line="240" w:lineRule="auto"/>
-        <w:jc w:val="both"/>
-      </w:pPr>
-      <w:r>
-        <w:rPr>
-          <w:rFonts w:ascii="Times New Roman" w:hAnsi="Times New Roman"/>
-          <w:b/>
+        <w:jc w:val="left"/>
+      </w:pPr>
+      <w:r>
+        <w:rPr>
+          <w:rFonts w:ascii="Times New Roman" w:hAnsi="Times New Roman"/>
           <w:bCs/>
           <w:sz w:val="20"/>
         </w:rPr>
@@ -4249,12 +4176,11 @@
       <w:pPr>
         <w:pStyle w:val="BodyText"/>
         <w:spacing w:before="0" w:after="0" w:line="240" w:lineRule="auto"/>
-        <w:jc w:val="both"/>
-      </w:pPr>
-      <w:r>
-        <w:rPr>
-          <w:rFonts w:ascii="Times New Roman" w:hAnsi="Times New Roman"/>
-          <w:b/>
+        <w:jc w:val="left"/>
+      </w:pPr>
+      <w:r>
+        <w:rPr>
+          <w:rFonts w:ascii="Times New Roman" w:hAnsi="Times New Roman"/>
           <w:bCs/>
           <w:sz w:val="20"/>
         </w:rPr>
@@ -4265,12 +4191,11 @@
       <w:pPr>
         <w:pStyle w:val="BodyText"/>
         <w:spacing w:before="0" w:after="0" w:line="240" w:lineRule="auto"/>
-        <w:jc w:val="both"/>
-      </w:pPr>
-      <w:r>
-        <w:rPr>
-          <w:rFonts w:ascii="Times New Roman" w:hAnsi="Times New Roman"/>
-          <w:b/>
+        <w:jc w:val="left"/>
+      </w:pPr>
+      <w:r>
+        <w:rPr>
+          <w:rFonts w:ascii="Times New Roman" w:hAnsi="Times New Roman"/>
           <w:bCs/>
           <w:sz w:val="20"/>
         </w:rPr>
@@ -4281,12 +4206,11 @@
       <w:pPr>
         <w:pStyle w:val="BlockText"/>
         <w:spacing w:before="0" w:after="0" w:line="240" w:lineRule="auto"/>
-        <w:jc w:val="both"/>
-      </w:pPr>
-      <w:r>
-        <w:rPr>
-          <w:rFonts w:ascii="Times New Roman" w:hAnsi="Times New Roman"/>
-          <w:i/>
+        <w:jc w:val="left"/>
+      </w:pPr>
+      <w:r>
+        <w:rPr>
+          <w:rFonts w:ascii="Times New Roman" w:hAnsi="Times New Roman"/>
           <w:iCs/>
           <w:sz w:val="20"/>
         </w:rPr>
@@ -4302,7 +4226,6 @@
       <w:r>
         <w:rPr>
           <w:rFonts w:ascii="Times New Roman" w:hAnsi="Times New Roman"/>
-          <w:i/>
           <w:iCs/>
           <w:sz w:val="20"/>
         </w:rPr>
@@ -4325,7 +4248,6 @@
       <w:r>
         <w:rPr>
           <w:rFonts w:ascii="Times New Roman" w:hAnsi="Times New Roman"/>
-          <w:i/>
           <w:iCs/>
           <w:sz w:val="20"/>
         </w:rPr>
@@ -4341,7 +4263,6 @@
       <w:r>
         <w:rPr>
           <w:rFonts w:ascii="Times New Roman" w:hAnsi="Times New Roman"/>
-          <w:i/>
           <w:iCs/>
           <w:sz w:val="20"/>
         </w:rPr>
@@ -4371,7 +4292,6 @@
       <w:r>
         <w:rPr>
           <w:rFonts w:ascii="Times New Roman" w:hAnsi="Times New Roman"/>
-          <w:i/>
           <w:iCs/>
           <w:sz w:val="20"/>
         </w:rPr>
@@ -4389,7 +4309,7 @@
       <w:pPr>
         <w:pStyle w:val="FirstParagraph"/>
         <w:spacing w:before="0" w:after="0" w:line="240" w:lineRule="auto"/>
-        <w:jc w:val="both"/>
+        <w:jc w:val="left"/>
       </w:pPr>
       <w:r>
         <w:rPr>
@@ -4408,7 +4328,6 @@
       <w:r>
         <w:rPr>
           <w:rFonts w:ascii="Times New Roman" w:hAnsi="Times New Roman"/>
-          <w:i/>
           <w:iCs/>
           <w:sz w:val="20"/>
         </w:rPr>
@@ -4438,7 +4357,6 @@
       <w:r>
         <w:rPr>
           <w:rFonts w:ascii="Times New Roman" w:hAnsi="Times New Roman"/>
-          <w:i/>
           <w:iCs/>
           <w:sz w:val="20"/>
         </w:rPr>
@@ -4468,7 +4386,6 @@
       <w:r>
         <w:rPr>
           <w:rFonts w:ascii="Times New Roman" w:hAnsi="Times New Roman"/>
-          <w:i/>
           <w:iCs/>
           <w:sz w:val="20"/>
         </w:rPr>
@@ -4488,7 +4405,7 @@
       <w:pPr>
         <w:pStyle w:val="Heading3"/>
         <w:spacing w:before="0" w:after="0" w:line="240" w:lineRule="auto"/>
-        <w:jc w:val="both"/>
+        <w:jc w:val="left"/>
       </w:pPr>
       <w:r>
         <w:rPr>
@@ -4503,7 +4420,7 @@
       <w:pPr>
         <w:pStyle w:val="FirstParagraph"/>
         <w:spacing w:before="0" w:after="0" w:line="240" w:lineRule="auto"/>
-        <w:jc w:val="both"/>
+        <w:jc w:val="left"/>
       </w:pPr>
       <w:r>
         <w:rPr>
@@ -4522,7 +4439,6 @@
       <w:r>
         <w:rPr>
           <w:rFonts w:ascii="Times New Roman" w:hAnsi="Times New Roman"/>
-          <w:i/>
           <w:iCs/>
           <w:sz w:val="20"/>
         </w:rPr>
@@ -4547,12 +4463,11 @@
       <w:pPr>
         <w:pStyle w:val="BodyText"/>
         <w:spacing w:before="0" w:after="0" w:line="240" w:lineRule="auto"/>
-        <w:jc w:val="both"/>
-      </w:pPr>
-      <w:r>
-        <w:rPr>
-          <w:rFonts w:ascii="Times New Roman" w:hAnsi="Times New Roman"/>
-          <w:b/>
+        <w:jc w:val="left"/>
+      </w:pPr>
+      <w:r>
+        <w:rPr>
+          <w:rFonts w:ascii="Times New Roman" w:hAnsi="Times New Roman"/>
           <w:bCs/>
           <w:sz w:val="20"/>
         </w:rPr>
@@ -4563,12 +4478,11 @@
       <w:pPr>
         <w:pStyle w:val="BlockText"/>
         <w:spacing w:before="0" w:after="0" w:line="240" w:lineRule="auto"/>
-        <w:jc w:val="both"/>
-      </w:pPr>
-      <w:r>
-        <w:rPr>
-          <w:rFonts w:ascii="Times New Roman" w:hAnsi="Times New Roman"/>
-          <w:i/>
+        <w:jc w:val="left"/>
+      </w:pPr>
+      <w:r>
+        <w:rPr>
+          <w:rFonts w:ascii="Times New Roman" w:hAnsi="Times New Roman"/>
           <w:iCs/>
           <w:sz w:val="20"/>
         </w:rPr>
@@ -4584,7 +4498,6 @@
       <w:r>
         <w:rPr>
           <w:rFonts w:ascii="Times New Roman" w:hAnsi="Times New Roman"/>
-          <w:i/>
           <w:iCs/>
           <w:sz w:val="20"/>
         </w:rPr>
@@ -4600,7 +4513,6 @@
       <w:r>
         <w:rPr>
           <w:rFonts w:ascii="Times New Roman" w:hAnsi="Times New Roman"/>
-          <w:i/>
           <w:iCs/>
           <w:sz w:val="20"/>
         </w:rPr>
@@ -4623,7 +4535,6 @@
       <w:r>
         <w:rPr>
           <w:rFonts w:ascii="Times New Roman" w:hAnsi="Times New Roman"/>
-          <w:i/>
           <w:iCs/>
           <w:sz w:val="20"/>
         </w:rPr>
@@ -4639,7 +4550,6 @@
       <w:r>
         <w:rPr>
           <w:rFonts w:ascii="Times New Roman" w:hAnsi="Times New Roman"/>
-          <w:i/>
           <w:iCs/>
           <w:sz w:val="20"/>
         </w:rPr>
@@ -4657,12 +4567,11 @@
       <w:pPr>
         <w:pStyle w:val="FirstParagraph"/>
         <w:spacing w:before="0" w:after="0" w:line="240" w:lineRule="auto"/>
-        <w:jc w:val="both"/>
-      </w:pPr>
-      <w:r>
-        <w:rPr>
-          <w:rFonts w:ascii="Times New Roman" w:hAnsi="Times New Roman"/>
-          <w:b/>
+        <w:jc w:val="left"/>
+      </w:pPr>
+      <w:r>
+        <w:rPr>
+          <w:rFonts w:ascii="Times New Roman" w:hAnsi="Times New Roman"/>
           <w:bCs/>
           <w:sz w:val="20"/>
         </w:rPr>
@@ -4673,12 +4582,11 @@
       <w:pPr>
         <w:pStyle w:val="BlockText"/>
         <w:spacing w:before="0" w:after="0" w:line="240" w:lineRule="auto"/>
-        <w:jc w:val="both"/>
-      </w:pPr>
-      <w:r>
-        <w:rPr>
-          <w:rFonts w:ascii="Times New Roman" w:hAnsi="Times New Roman"/>
-          <w:i/>
+        <w:jc w:val="left"/>
+      </w:pPr>
+      <w:r>
+        <w:rPr>
+          <w:rFonts w:ascii="Times New Roman" w:hAnsi="Times New Roman"/>
           <w:iCs/>
           <w:sz w:val="20"/>
         </w:rPr>
@@ -4694,7 +4602,6 @@
       <w:r>
         <w:rPr>
           <w:rFonts w:ascii="Times New Roman" w:hAnsi="Times New Roman"/>
-          <w:i/>
           <w:iCs/>
           <w:sz w:val="20"/>
         </w:rPr>
@@ -4717,7 +4624,6 @@
       <w:r>
         <w:rPr>
           <w:rFonts w:ascii="Times New Roman" w:hAnsi="Times New Roman"/>
-          <w:i/>
           <w:iCs/>
           <w:sz w:val="20"/>
         </w:rPr>
@@ -4733,7 +4639,6 @@
       <w:r>
         <w:rPr>
           <w:rFonts w:ascii="Times New Roman" w:hAnsi="Times New Roman"/>
-          <w:i/>
           <w:iCs/>
           <w:sz w:val="20"/>
         </w:rPr>
@@ -4756,7 +4661,6 @@
       <w:r>
         <w:rPr>
           <w:rFonts w:ascii="Times New Roman" w:hAnsi="Times New Roman"/>
-          <w:i/>
           <w:iCs/>
           <w:sz w:val="20"/>
         </w:rPr>
@@ -4772,7 +4676,6 @@
       <w:r>
         <w:rPr>
           <w:rFonts w:ascii="Times New Roman" w:hAnsi="Times New Roman"/>
-          <w:i/>
           <w:iCs/>
           <w:sz w:val="20"/>
         </w:rPr>
@@ -4790,12 +4693,11 @@
       <w:pPr>
         <w:pStyle w:val="FirstParagraph"/>
         <w:spacing w:before="0" w:after="0" w:line="240" w:lineRule="auto"/>
-        <w:jc w:val="both"/>
-      </w:pPr>
-      <w:r>
-        <w:rPr>
-          <w:rFonts w:ascii="Times New Roman" w:hAnsi="Times New Roman"/>
-          <w:b/>
+        <w:jc w:val="left"/>
+      </w:pPr>
+      <w:r>
+        <w:rPr>
+          <w:rFonts w:ascii="Times New Roman" w:hAnsi="Times New Roman"/>
           <w:bCs/>
           <w:sz w:val="20"/>
         </w:rPr>
@@ -4806,12 +4708,11 @@
       <w:pPr>
         <w:pStyle w:val="BlockText"/>
         <w:spacing w:before="0" w:after="0" w:line="240" w:lineRule="auto"/>
-        <w:jc w:val="both"/>
-      </w:pPr>
-      <w:r>
-        <w:rPr>
-          <w:rFonts w:ascii="Times New Roman" w:hAnsi="Times New Roman"/>
-          <w:i/>
+        <w:jc w:val="left"/>
+      </w:pPr>
+      <w:r>
+        <w:rPr>
+          <w:rFonts w:ascii="Times New Roman" w:hAnsi="Times New Roman"/>
           <w:iCs/>
           <w:sz w:val="20"/>
         </w:rPr>
@@ -4827,7 +4728,6 @@
       <w:r>
         <w:rPr>
           <w:rFonts w:ascii="Times New Roman" w:hAnsi="Times New Roman"/>
-          <w:i/>
           <w:iCs/>
           <w:sz w:val="20"/>
         </w:rPr>
@@ -4850,7 +4750,6 @@
       <w:r>
         <w:rPr>
           <w:rFonts w:ascii="Times New Roman" w:hAnsi="Times New Roman"/>
-          <w:i/>
           <w:iCs/>
           <w:sz w:val="20"/>
         </w:rPr>
@@ -4866,7 +4765,6 @@
       <w:r>
         <w:rPr>
           <w:rFonts w:ascii="Times New Roman" w:hAnsi="Times New Roman"/>
-          <w:i/>
           <w:iCs/>
           <w:sz w:val="20"/>
         </w:rPr>
@@ -4889,7 +4787,6 @@
       <w:r>
         <w:rPr>
           <w:rFonts w:ascii="Times New Roman" w:hAnsi="Times New Roman"/>
-          <w:i/>
           <w:iCs/>
           <w:sz w:val="20"/>
         </w:rPr>
@@ -4907,7 +4804,7 @@
       <w:pPr>
         <w:pStyle w:val="FirstParagraph"/>
         <w:spacing w:before="0" w:after="0" w:line="240" w:lineRule="auto"/>
-        <w:jc w:val="both"/>
+        <w:jc w:val="left"/>
       </w:pPr>
       <w:r>
         <w:rPr>
@@ -4926,7 +4823,6 @@
       <w:r>
         <w:rPr>
           <w:rFonts w:ascii="Times New Roman" w:hAnsi="Times New Roman"/>
-          <w:i/>
           <w:iCs/>
           <w:sz w:val="20"/>
         </w:rPr>
@@ -4943,7 +4839,7 @@
     <w:p>
       <w:pPr>
         <w:spacing w:before="0" w:after="0" w:line="240" w:lineRule="auto"/>
-        <w:jc w:val="both"/>
+        <w:jc w:val="left"/>
       </w:pPr>
       <w:r>
         <w:rPr>
@@ -4962,7 +4858,7 @@
       <w:pPr>
         <w:pStyle w:val="Heading2"/>
         <w:spacing w:before="0" w:after="0" w:line="240" w:lineRule="auto"/>
-        <w:jc w:val="both"/>
+        <w:jc w:val="left"/>
       </w:pPr>
       <w:r>
         <w:rPr>
@@ -4977,7 +4873,7 @@
       <w:pPr>
         <w:pStyle w:val="FirstParagraph"/>
         <w:spacing w:before="0" w:after="0" w:line="240" w:lineRule="auto"/>
-        <w:jc w:val="both"/>
+        <w:jc w:val="left"/>
       </w:pPr>
       <w:r>
         <w:rPr>
@@ -4995,12 +4891,11 @@
           <w:numId w:val="1002"/>
         </w:numPr>
         <w:spacing w:before="0" w:after="0" w:line="240" w:lineRule="auto"/>
-        <w:jc w:val="both"/>
-      </w:pPr>
-      <w:r>
-        <w:rPr>
-          <w:rFonts w:ascii="Times New Roman" w:hAnsi="Times New Roman"/>
-          <w:b/>
+        <w:jc w:val="left"/>
+      </w:pPr>
+      <w:r>
+        <w:rPr>
+          <w:rFonts w:ascii="Times New Roman" w:hAnsi="Times New Roman"/>
           <w:bCs/>
           <w:sz w:val="20"/>
         </w:rPr>
@@ -5029,12 +4924,11 @@
           <w:numId w:val="1002"/>
         </w:numPr>
         <w:spacing w:before="0" w:after="0" w:line="240" w:lineRule="auto"/>
-        <w:jc w:val="both"/>
-      </w:pPr>
-      <w:r>
-        <w:rPr>
-          <w:rFonts w:ascii="Times New Roman" w:hAnsi="Times New Roman"/>
-          <w:b/>
+        <w:jc w:val="left"/>
+      </w:pPr>
+      <w:r>
+        <w:rPr>
+          <w:rFonts w:ascii="Times New Roman" w:hAnsi="Times New Roman"/>
           <w:bCs/>
           <w:sz w:val="20"/>
         </w:rPr>
@@ -5063,12 +4957,11 @@
           <w:numId w:val="1002"/>
         </w:numPr>
         <w:spacing w:before="0" w:after="0" w:line="240" w:lineRule="auto"/>
-        <w:jc w:val="both"/>
-      </w:pPr>
-      <w:r>
-        <w:rPr>
-          <w:rFonts w:ascii="Times New Roman" w:hAnsi="Times New Roman"/>
-          <w:b/>
+        <w:jc w:val="left"/>
+      </w:pPr>
+      <w:r>
+        <w:rPr>
+          <w:rFonts w:ascii="Times New Roman" w:hAnsi="Times New Roman"/>
           <w:bCs/>
           <w:sz w:val="20"/>
         </w:rPr>
@@ -5097,12 +4990,11 @@
           <w:numId w:val="1002"/>
         </w:numPr>
         <w:spacing w:before="0" w:after="0" w:line="240" w:lineRule="auto"/>
-        <w:jc w:val="both"/>
-      </w:pPr>
-      <w:r>
-        <w:rPr>
-          <w:rFonts w:ascii="Times New Roman" w:hAnsi="Times New Roman"/>
-          <w:b/>
+        <w:jc w:val="left"/>
+      </w:pPr>
+      <w:r>
+        <w:rPr>
+          <w:rFonts w:ascii="Times New Roman" w:hAnsi="Times New Roman"/>
           <w:bCs/>
           <w:sz w:val="20"/>
         </w:rPr>
@@ -5131,12 +5023,11 @@
           <w:numId w:val="1002"/>
         </w:numPr>
         <w:spacing w:before="0" w:after="0" w:line="240" w:lineRule="auto"/>
-        <w:jc w:val="both"/>
-      </w:pPr>
-      <w:r>
-        <w:rPr>
-          <w:rFonts w:ascii="Times New Roman" w:hAnsi="Times New Roman"/>
-          <w:b/>
+        <w:jc w:val="left"/>
+      </w:pPr>
+      <w:r>
+        <w:rPr>
+          <w:rFonts w:ascii="Times New Roman" w:hAnsi="Times New Roman"/>
           <w:bCs/>
           <w:sz w:val="20"/>
         </w:rPr>
@@ -5193,12 +5084,11 @@
           <w:numId w:val="1002"/>
         </w:numPr>
         <w:spacing w:before="0" w:after="0" w:line="240" w:lineRule="auto"/>
-        <w:jc w:val="both"/>
-      </w:pPr>
-      <w:r>
-        <w:rPr>
-          <w:rFonts w:ascii="Times New Roman" w:hAnsi="Times New Roman"/>
-          <w:b/>
+        <w:jc w:val="left"/>
+      </w:pPr>
+      <w:r>
+        <w:rPr>
+          <w:rFonts w:ascii="Times New Roman" w:hAnsi="Times New Roman"/>
           <w:bCs/>
           <w:sz w:val="20"/>
         </w:rPr>
@@ -5227,12 +5117,11 @@
           <w:numId w:val="1002"/>
         </w:numPr>
         <w:spacing w:before="0" w:after="0" w:line="240" w:lineRule="auto"/>
-        <w:jc w:val="both"/>
-      </w:pPr>
-      <w:r>
-        <w:rPr>
-          <w:rFonts w:ascii="Times New Roman" w:hAnsi="Times New Roman"/>
-          <w:b/>
+        <w:jc w:val="left"/>
+      </w:pPr>
+      <w:r>
+        <w:rPr>
+          <w:rFonts w:ascii="Times New Roman" w:hAnsi="Times New Roman"/>
           <w:bCs/>
           <w:sz w:val="20"/>
         </w:rPr>
@@ -5257,7 +5146,7 @@
       <w:pPr>
         <w:pStyle w:val="FirstParagraph"/>
         <w:spacing w:before="0" w:after="0" w:line="240" w:lineRule="auto"/>
-        <w:jc w:val="both"/>
+        <w:jc w:val="left"/>
       </w:pPr>
       <w:r>
         <w:rPr>
@@ -5270,7 +5159,7 @@
     <w:p>
       <w:pPr>
         <w:spacing w:before="0" w:after="0" w:line="240" w:lineRule="auto"/>
-        <w:jc w:val="both"/>
+        <w:jc w:val="left"/>
       </w:pPr>
       <w:r>
         <w:rPr>
@@ -5288,7 +5177,7 @@
       <w:pPr>
         <w:pStyle w:val="Heading2"/>
         <w:spacing w:before="0" w:after="0" w:line="240" w:lineRule="auto"/>
-        <w:jc w:val="both"/>
+        <w:jc w:val="left"/>
       </w:pPr>
       <w:r>
         <w:rPr>
@@ -5303,7 +5192,7 @@
       <w:pPr>
         <w:pStyle w:val="FirstParagraph"/>
         <w:spacing w:before="0" w:after="0" w:line="240" w:lineRule="auto"/>
-        <w:jc w:val="both"/>
+        <w:jc w:val="left"/>
       </w:pPr>
       <w:r>
         <w:rPr>
@@ -5318,7 +5207,7 @@
       <w:pPr>
         <w:pStyle w:val="Heading3"/>
         <w:spacing w:before="0" w:after="0" w:line="240" w:lineRule="auto"/>
-        <w:jc w:val="both"/>
+        <w:jc w:val="left"/>
       </w:pPr>
       <w:r>
         <w:rPr>
@@ -5333,7 +5222,7 @@
       <w:pPr>
         <w:pStyle w:val="FirstParagraph"/>
         <w:spacing w:before="0" w:after="0" w:line="240" w:lineRule="auto"/>
-        <w:jc w:val="both"/>
+        <w:jc w:val="left"/>
       </w:pPr>
       <w:r>
         <w:rPr>
@@ -5347,12 +5236,11 @@
       <w:pPr>
         <w:pStyle w:val="BodyText"/>
         <w:spacing w:before="0" w:after="0" w:line="240" w:lineRule="auto"/>
-        <w:jc w:val="both"/>
-      </w:pPr>
-      <w:r>
-        <w:rPr>
-          <w:rFonts w:ascii="Times New Roman" w:hAnsi="Times New Roman"/>
-          <w:b/>
+        <w:jc w:val="left"/>
+      </w:pPr>
+      <w:r>
+        <w:rPr>
+          <w:rFonts w:ascii="Times New Roman" w:hAnsi="Times New Roman"/>
           <w:bCs/>
           <w:sz w:val="20"/>
         </w:rPr>
@@ -5562,7 +5450,7 @@
       <w:pPr>
         <w:pStyle w:val="BodyText"/>
         <w:spacing w:before="0" w:after="0" w:line="240" w:lineRule="auto"/>
-        <w:jc w:val="both"/>
+        <w:jc w:val="left"/>
       </w:pPr>
       <w:r>
         <w:rPr>
@@ -5578,7 +5466,7 @@
       <w:pPr>
         <w:pStyle w:val="Heading3"/>
         <w:spacing w:before="0" w:after="0" w:line="240" w:lineRule="auto"/>
-        <w:jc w:val="both"/>
+        <w:jc w:val="left"/>
       </w:pPr>
       <w:r>
         <w:rPr>
@@ -5593,7 +5481,7 @@
       <w:pPr>
         <w:pStyle w:val="FirstParagraph"/>
         <w:spacing w:before="0" w:after="0" w:line="240" w:lineRule="auto"/>
-        <w:jc w:val="both"/>
+        <w:jc w:val="left"/>
       </w:pPr>
       <w:r>
         <w:rPr>
@@ -5662,7 +5550,7 @@
     <w:p>
       <w:pPr>
         <w:spacing w:before="0" w:after="0" w:line="240" w:lineRule="auto"/>
-        <w:jc w:val="both"/>
+        <w:jc w:val="left"/>
       </w:pPr>
       <w:r>
         <w:rPr>
@@ -5681,7 +5569,7 @@
       <w:pPr>
         <w:pStyle w:val="Heading2"/>
         <w:spacing w:before="0" w:after="0" w:line="240" w:lineRule="auto"/>
-        <w:jc w:val="both"/>
+        <w:jc w:val="left"/>
       </w:pPr>
       <w:r>
         <w:rPr>
@@ -5696,7 +5584,7 @@
       <w:pPr>
         <w:pStyle w:val="FirstParagraph"/>
         <w:spacing w:before="0" w:after="0" w:line="240" w:lineRule="auto"/>
-        <w:jc w:val="both"/>
+        <w:jc w:val="left"/>
       </w:pPr>
       <w:r>
         <w:rPr>
@@ -5714,12 +5602,11 @@
           <w:numId w:val="1003"/>
         </w:numPr>
         <w:spacing w:before="0" w:after="0" w:line="240" w:lineRule="auto"/>
-        <w:jc w:val="both"/>
-      </w:pPr>
-      <w:r>
-        <w:rPr>
-          <w:rFonts w:ascii="Times New Roman" w:hAnsi="Times New Roman"/>
-          <w:b/>
+        <w:jc w:val="left"/>
+      </w:pPr>
+      <w:r>
+        <w:rPr>
+          <w:rFonts w:ascii="Times New Roman" w:hAnsi="Times New Roman"/>
           <w:bCs/>
           <w:sz w:val="20"/>
         </w:rPr>
@@ -5748,12 +5635,11 @@
           <w:numId w:val="1003"/>
         </w:numPr>
         <w:spacing w:before="0" w:after="0" w:line="240" w:lineRule="auto"/>
-        <w:jc w:val="both"/>
-      </w:pPr>
-      <w:r>
-        <w:rPr>
-          <w:rFonts w:ascii="Times New Roman" w:hAnsi="Times New Roman"/>
-          <w:b/>
+        <w:jc w:val="left"/>
+      </w:pPr>
+      <w:r>
+        <w:rPr>
+          <w:rFonts w:ascii="Times New Roman" w:hAnsi="Times New Roman"/>
           <w:bCs/>
           <w:sz w:val="20"/>
         </w:rPr>
@@ -5782,12 +5668,11 @@
           <w:numId w:val="1003"/>
         </w:numPr>
         <w:spacing w:before="0" w:after="0" w:line="240" w:lineRule="auto"/>
-        <w:jc w:val="both"/>
-      </w:pPr>
-      <w:r>
-        <w:rPr>
-          <w:rFonts w:ascii="Times New Roman" w:hAnsi="Times New Roman"/>
-          <w:b/>
+        <w:jc w:val="left"/>
+      </w:pPr>
+      <w:r>
+        <w:rPr>
+          <w:rFonts w:ascii="Times New Roman" w:hAnsi="Times New Roman"/>
           <w:bCs/>
           <w:sz w:val="20"/>
         </w:rPr>
@@ -5879,12 +5764,11 @@
           <w:numId w:val="1003"/>
         </w:numPr>
         <w:spacing w:before="0" w:after="0" w:line="240" w:lineRule="auto"/>
-        <w:jc w:val="both"/>
-      </w:pPr>
-      <w:r>
-        <w:rPr>
-          <w:rFonts w:ascii="Times New Roman" w:hAnsi="Times New Roman"/>
-          <w:b/>
+        <w:jc w:val="left"/>
+      </w:pPr>
+      <w:r>
+        <w:rPr>
+          <w:rFonts w:ascii="Times New Roman" w:hAnsi="Times New Roman"/>
           <w:bCs/>
           <w:sz w:val="20"/>
         </w:rPr>
@@ -5913,12 +5797,11 @@
           <w:numId w:val="1003"/>
         </w:numPr>
         <w:spacing w:before="0" w:after="0" w:line="240" w:lineRule="auto"/>
-        <w:jc w:val="both"/>
-      </w:pPr>
-      <w:r>
-        <w:rPr>
-          <w:rFonts w:ascii="Times New Roman" w:hAnsi="Times New Roman"/>
-          <w:b/>
+        <w:jc w:val="left"/>
+      </w:pPr>
+      <w:r>
+        <w:rPr>
+          <w:rFonts w:ascii="Times New Roman" w:hAnsi="Times New Roman"/>
           <w:bCs/>
           <w:sz w:val="20"/>
         </w:rPr>
@@ -5947,12 +5830,11 @@
           <w:numId w:val="1003"/>
         </w:numPr>
         <w:spacing w:before="0" w:after="0" w:line="240" w:lineRule="auto"/>
-        <w:jc w:val="both"/>
-      </w:pPr>
-      <w:r>
-        <w:rPr>
-          <w:rFonts w:ascii="Times New Roman" w:hAnsi="Times New Roman"/>
-          <w:b/>
+        <w:jc w:val="left"/>
+      </w:pPr>
+      <w:r>
+        <w:rPr>
+          <w:rFonts w:ascii="Times New Roman" w:hAnsi="Times New Roman"/>
           <w:bCs/>
           <w:sz w:val="20"/>
         </w:rPr>
@@ -5976,7 +5858,7 @@
     <w:p>
       <w:pPr>
         <w:spacing w:before="0" w:after="0" w:line="240" w:lineRule="auto"/>
-        <w:jc w:val="both"/>
+        <w:jc w:val="left"/>
       </w:pPr>
       <w:r>
         <w:rPr>
@@ -5994,7 +5876,7 @@
       <w:pPr>
         <w:pStyle w:val="Heading2"/>
         <w:spacing w:before="0" w:after="0" w:line="240" w:lineRule="auto"/>
-        <w:jc w:val="both"/>
+        <w:jc w:val="left"/>
       </w:pPr>
       <w:r>
         <w:rPr>
@@ -6013,12 +5895,11 @@
           <w:numId w:val="1004"/>
         </w:numPr>
         <w:spacing w:before="0" w:after="0" w:line="240" w:lineRule="auto"/>
-        <w:jc w:val="both"/>
-      </w:pPr>
-      <w:r>
-        <w:rPr>
-          <w:rFonts w:ascii="Times New Roman" w:hAnsi="Times New Roman"/>
-          <w:b/>
+        <w:jc w:val="left"/>
+      </w:pPr>
+      <w:r>
+        <w:rPr>
+          <w:rFonts w:ascii="Times New Roman" w:hAnsi="Times New Roman"/>
           <w:bCs/>
           <w:sz w:val="20"/>
         </w:rPr>
@@ -6076,12 +5957,11 @@
           <w:numId w:val="1004"/>
         </w:numPr>
         <w:spacing w:before="0" w:after="0" w:line="240" w:lineRule="auto"/>
-        <w:jc w:val="both"/>
-      </w:pPr>
-      <w:r>
-        <w:rPr>
-          <w:rFonts w:ascii="Times New Roman" w:hAnsi="Times New Roman"/>
-          <w:b/>
+        <w:jc w:val="left"/>
+      </w:pPr>
+      <w:r>
+        <w:rPr>
+          <w:rFonts w:ascii="Times New Roman" w:hAnsi="Times New Roman"/>
           <w:bCs/>
           <w:sz w:val="20"/>
         </w:rPr>
@@ -6110,12 +5990,11 @@
           <w:numId w:val="1004"/>
         </w:numPr>
         <w:spacing w:before="0" w:after="0" w:line="240" w:lineRule="auto"/>
-        <w:jc w:val="both"/>
-      </w:pPr>
-      <w:r>
-        <w:rPr>
-          <w:rFonts w:ascii="Times New Roman" w:hAnsi="Times New Roman"/>
-          <w:b/>
+        <w:jc w:val="left"/>
+      </w:pPr>
+      <w:r>
+        <w:rPr>
+          <w:rFonts w:ascii="Times New Roman" w:hAnsi="Times New Roman"/>
           <w:bCs/>
           <w:sz w:val="20"/>
         </w:rPr>
@@ -6144,12 +6023,11 @@
           <w:numId w:val="1004"/>
         </w:numPr>
         <w:spacing w:before="0" w:after="0" w:line="240" w:lineRule="auto"/>
-        <w:jc w:val="both"/>
-      </w:pPr>
-      <w:r>
-        <w:rPr>
-          <w:rFonts w:ascii="Times New Roman" w:hAnsi="Times New Roman"/>
-          <w:b/>
+        <w:jc w:val="left"/>
+      </w:pPr>
+      <w:r>
+        <w:rPr>
+          <w:rFonts w:ascii="Times New Roman" w:hAnsi="Times New Roman"/>
           <w:bCs/>
           <w:sz w:val="20"/>
         </w:rPr>
@@ -6178,12 +6056,11 @@
           <w:numId w:val="1004"/>
         </w:numPr>
         <w:spacing w:before="0" w:after="0" w:line="240" w:lineRule="auto"/>
-        <w:jc w:val="both"/>
-      </w:pPr>
-      <w:r>
-        <w:rPr>
-          <w:rFonts w:ascii="Times New Roman" w:hAnsi="Times New Roman"/>
-          <w:b/>
+        <w:jc w:val="left"/>
+      </w:pPr>
+      <w:r>
+        <w:rPr>
+          <w:rFonts w:ascii="Times New Roman" w:hAnsi="Times New Roman"/>
           <w:bCs/>
           <w:sz w:val="20"/>
         </w:rPr>
@@ -6212,12 +6089,11 @@
           <w:numId w:val="1004"/>
         </w:numPr>
         <w:spacing w:before="0" w:after="0" w:line="240" w:lineRule="auto"/>
-        <w:jc w:val="both"/>
-      </w:pPr>
-      <w:r>
-        <w:rPr>
-          <w:rFonts w:ascii="Times New Roman" w:hAnsi="Times New Roman"/>
-          <w:b/>
+        <w:jc w:val="left"/>
+      </w:pPr>
+      <w:r>
+        <w:rPr>
+          <w:rFonts w:ascii="Times New Roman" w:hAnsi="Times New Roman"/>
           <w:bCs/>
           <w:sz w:val="20"/>
         </w:rPr>
@@ -6246,12 +6122,11 @@
           <w:numId w:val="1004"/>
         </w:numPr>
         <w:spacing w:before="0" w:after="0" w:line="240" w:lineRule="auto"/>
-        <w:jc w:val="both"/>
-      </w:pPr>
-      <w:r>
-        <w:rPr>
-          <w:rFonts w:ascii="Times New Roman" w:hAnsi="Times New Roman"/>
-          <w:b/>
+        <w:jc w:val="left"/>
+      </w:pPr>
+      <w:r>
+        <w:rPr>
+          <w:rFonts w:ascii="Times New Roman" w:hAnsi="Times New Roman"/>
           <w:bCs/>
           <w:sz w:val="20"/>
         </w:rPr>
@@ -6275,7 +6150,7 @@
     <w:p>
       <w:pPr>
         <w:spacing w:before="0" w:after="0" w:line="240" w:lineRule="auto"/>
-        <w:jc w:val="both"/>
+        <w:jc w:val="left"/>
       </w:pPr>
       <w:r>
         <w:rPr>
@@ -6293,7 +6168,7 @@
       <w:pPr>
         <w:pStyle w:val="Heading2"/>
         <w:spacing w:before="0" w:after="0" w:line="240" w:lineRule="auto"/>
-        <w:jc w:val="both"/>
+        <w:jc w:val="left"/>
       </w:pPr>
       <w:r>
         <w:rPr>
@@ -6308,7 +6183,7 @@
       <w:pPr>
         <w:pStyle w:val="FirstParagraph"/>
         <w:spacing w:before="0" w:after="0" w:line="240" w:lineRule="auto"/>
-        <w:jc w:val="both"/>
+        <w:jc w:val="left"/>
       </w:pPr>
       <w:r>
         <w:rPr>
@@ -6378,7 +6253,7 @@
       <w:pPr>
         <w:pStyle w:val="BodyText"/>
         <w:spacing w:before="0" w:after="0" w:line="240" w:lineRule="auto"/>
-        <w:jc w:val="both"/>
+        <w:jc w:val="left"/>
       </w:pPr>
       <w:r>
         <w:rPr>
@@ -6434,7 +6309,7 @@
       <w:pPr>
         <w:pStyle w:val="BodyText"/>
         <w:spacing w:before="0" w:after="0" w:line="240" w:lineRule="auto"/>
-        <w:jc w:val="both"/>
+        <w:jc w:val="left"/>
       </w:pPr>
       <w:r>
         <w:rPr>
@@ -6489,7 +6364,7 @@
     <w:p>
       <w:pPr>
         <w:spacing w:before="0" w:after="0" w:line="240" w:lineRule="auto"/>
-        <w:jc w:val="both"/>
+        <w:jc w:val="left"/>
       </w:pPr>
       <w:r>
         <w:rPr>
@@ -6507,7 +6382,7 @@
       <w:pPr>
         <w:pStyle w:val="Heading2"/>
         <w:spacing w:before="0" w:after="0" w:line="240" w:lineRule="auto"/>
-        <w:jc w:val="both"/>
+        <w:jc w:val="left"/>
       </w:pPr>
       <w:r>
         <w:rPr>
@@ -6522,7 +6397,7 @@
       <w:pPr>
         <w:pStyle w:val="FirstParagraph"/>
         <w:spacing w:before="0" w:after="0" w:line="240" w:lineRule="auto"/>
-        <w:jc w:val="both"/>
+        <w:jc w:val="left"/>
       </w:pPr>
       <w:r>
         <w:rPr>
@@ -6536,7 +6411,7 @@
       <w:pPr>
         <w:pStyle w:val="BodyText"/>
         <w:spacing w:before="0" w:after="0" w:line="240" w:lineRule="auto"/>
-        <w:jc w:val="both"/>
+        <w:jc w:val="left"/>
       </w:pPr>
       <w:r>
         <w:rPr>
@@ -6555,7 +6430,6 @@
       <w:r>
         <w:rPr>
           <w:rFonts w:ascii="Times New Roman" w:hAnsi="Times New Roman"/>
-          <w:i/>
           <w:iCs/>
           <w:sz w:val="20"/>
         </w:rPr>
@@ -6580,7 +6454,7 @@
       <w:pPr>
         <w:pStyle w:val="BodyText"/>
         <w:spacing w:before="0" w:after="0" w:line="240" w:lineRule="auto"/>
-        <w:jc w:val="both"/>
+        <w:jc w:val="left"/>
       </w:pPr>
       <w:r>
         <w:rPr>
@@ -6594,7 +6468,7 @@
       <w:pPr>
         <w:pStyle w:val="BodyText"/>
         <w:spacing w:before="0" w:after="0" w:line="240" w:lineRule="auto"/>
-        <w:jc w:val="both"/>
+        <w:jc w:val="left"/>
       </w:pPr>
       <w:r>
         <w:rPr>
@@ -6607,7 +6481,7 @@
     <w:p>
       <w:pPr>
         <w:spacing w:before="0" w:after="0" w:line="240" w:lineRule="auto"/>
-        <w:jc w:val="both"/>
+        <w:jc w:val="left"/>
       </w:pPr>
       <w:r>
         <w:rPr>
@@ -6625,7 +6499,7 @@
       <w:pPr>
         <w:pStyle w:val="Heading2"/>
         <w:spacing w:before="0" w:after="0" w:line="240" w:lineRule="auto"/>
-        <w:jc w:val="both"/>
+        <w:jc w:val="left"/>
       </w:pPr>
       <w:r>
         <w:rPr>
@@ -6640,12 +6514,11 @@
       <w:pPr>
         <w:pStyle w:val="FirstParagraph"/>
         <w:spacing w:before="0" w:after="0" w:line="240" w:lineRule="auto"/>
-        <w:jc w:val="both"/>
-      </w:pPr>
-      <w:r>
-        <w:rPr>
-          <w:rFonts w:ascii="Times New Roman" w:hAnsi="Times New Roman"/>
-          <w:b w:val="0"/>
+        <w:jc w:val="left"/>
+      </w:pPr>
+      <w:r>
+        <w:rPr>
+          <w:rFonts w:ascii="Times New Roman" w:hAnsi="Times New Roman"/>
           <w:sz w:val="22"/>
         </w:rPr>
         <w:t xml:space="preserve">The authors gratefully acknowledge the support of the Department of AI and Emerging Technologies, Chinmaya Vishwavidyapeeth Deemed-to-be University, Ernakulam, for providing the resources and guidance necessary for this research.</w:t>
@@ -6654,7 +6527,7 @@
     <w:p>
       <w:pPr>
         <w:spacing w:before="0" w:after="0" w:line="240" w:lineRule="auto"/>
-        <w:jc w:val="both"/>
+        <w:jc w:val="left"/>
       </w:pPr>
       <w:r>
         <w:rPr>
@@ -6672,7 +6545,7 @@
       <w:pPr>
         <w:pStyle w:val="Heading2"/>
         <w:spacing w:before="0" w:after="0" w:line="240" w:lineRule="auto"/>
-        <w:jc w:val="both"/>
+        <w:jc w:val="left"/>
       </w:pPr>
       <w:r>
         <w:rPr>
@@ -6687,7 +6560,7 @@
       <w:pPr>
         <w:pStyle w:val="FirstParagraph"/>
         <w:spacing w:before="0" w:after="0" w:line="240" w:lineRule="auto"/>
-        <w:jc w:val="both"/>
+        <w:jc w:val="left"/>
       </w:pPr>
       <w:r>
         <w:rPr>
@@ -6701,7 +6574,7 @@
       <w:pPr>
         <w:pStyle w:val="BodyText"/>
         <w:spacing w:before="0" w:after="0" w:line="240" w:lineRule="auto"/>
-        <w:jc w:val="both"/>
+        <w:jc w:val="left"/>
       </w:pPr>
       <w:r>
         <w:rPr>
@@ -6715,7 +6588,7 @@
       <w:pPr>
         <w:pStyle w:val="BodyText"/>
         <w:spacing w:before="0" w:after="0" w:line="240" w:lineRule="auto"/>
-        <w:jc w:val="both"/>
+        <w:jc w:val="left"/>
       </w:pPr>
       <w:r>
         <w:rPr>
@@ -6729,7 +6602,7 @@
       <w:pPr>
         <w:pStyle w:val="BodyText"/>
         <w:spacing w:before="0" w:after="0" w:line="240" w:lineRule="auto"/>
-        <w:jc w:val="both"/>
+        <w:jc w:val="left"/>
       </w:pPr>
       <w:r>
         <w:rPr>
@@ -6748,7 +6621,6 @@
       <w:r>
         <w:rPr>
           <w:rFonts w:ascii="Times New Roman" w:hAnsi="Times New Roman"/>
-          <w:i/>
           <w:iCs/>
           <w:sz w:val="20"/>
         </w:rPr>
@@ -6771,7 +6643,6 @@
       <w:r>
         <w:rPr>
           <w:rFonts w:ascii="Times New Roman" w:hAnsi="Times New Roman"/>
-          <w:b/>
           <w:bCs/>
           <w:sz w:val="20"/>
         </w:rPr>
@@ -6789,7 +6660,7 @@
       <w:pPr>
         <w:pStyle w:val="BodyText"/>
         <w:spacing w:before="0" w:after="0" w:line="240" w:lineRule="auto"/>
-        <w:jc w:val="both"/>
+        <w:jc w:val="left"/>
       </w:pPr>
       <w:r>
         <w:rPr>
@@ -6808,7 +6679,6 @@
       <w:r>
         <w:rPr>
           <w:rFonts w:ascii="Times New Roman" w:hAnsi="Times New Roman"/>
-          <w:i/>
           <w:iCs/>
           <w:sz w:val="20"/>
         </w:rPr>
@@ -6831,7 +6701,6 @@
       <w:r>
         <w:rPr>
           <w:rFonts w:ascii="Times New Roman" w:hAnsi="Times New Roman"/>
-          <w:b/>
           <w:bCs/>
           <w:sz w:val="20"/>
         </w:rPr>
@@ -6849,7 +6718,7 @@
       <w:pPr>
         <w:pStyle w:val="BodyText"/>
         <w:spacing w:before="0" w:after="0" w:line="240" w:lineRule="auto"/>
-        <w:jc w:val="both"/>
+        <w:jc w:val="left"/>
       </w:pPr>
       <w:r>
         <w:rPr>
@@ -6868,7 +6737,6 @@
       <w:r>
         <w:rPr>
           <w:rFonts w:ascii="Times New Roman" w:hAnsi="Times New Roman"/>
-          <w:i/>
           <w:iCs/>
           <w:sz w:val="20"/>
         </w:rPr>
@@ -6891,7 +6759,6 @@
       <w:r>
         <w:rPr>
           <w:rFonts w:ascii="Times New Roman" w:hAnsi="Times New Roman"/>
-          <w:b/>
           <w:bCs/>
           <w:sz w:val="20"/>
         </w:rPr>
@@ -6909,7 +6776,7 @@
       <w:pPr>
         <w:pStyle w:val="BodyText"/>
         <w:spacing w:before="0" w:after="0" w:line="240" w:lineRule="auto"/>
-        <w:jc w:val="both"/>
+        <w:jc w:val="left"/>
       </w:pPr>
       <w:r>
         <w:rPr>
@@ -6928,7 +6795,6 @@
       <w:r>
         <w:rPr>
           <w:rFonts w:ascii="Times New Roman" w:hAnsi="Times New Roman"/>
-          <w:i/>
           <w:iCs/>
           <w:sz w:val="20"/>
         </w:rPr>
@@ -6951,7 +6817,6 @@
       <w:r>
         <w:rPr>
           <w:rFonts w:ascii="Times New Roman" w:hAnsi="Times New Roman"/>
-          <w:b/>
           <w:bCs/>
           <w:sz w:val="20"/>
         </w:rPr>
@@ -6969,7 +6834,7 @@
       <w:pPr>
         <w:pStyle w:val="BodyText"/>
         <w:spacing w:before="0" w:after="0" w:line="240" w:lineRule="auto"/>
-        <w:jc w:val="both"/>
+        <w:jc w:val="left"/>
       </w:pPr>
       <w:r>
         <w:rPr>
@@ -6988,7 +6853,6 @@
       <w:r>
         <w:rPr>
           <w:rFonts w:ascii="Times New Roman" w:hAnsi="Times New Roman"/>
-          <w:i/>
           <w:iCs/>
           <w:sz w:val="20"/>
         </w:rPr>
@@ -7011,7 +6875,6 @@
       <w:r>
         <w:rPr>
           <w:rFonts w:ascii="Times New Roman" w:hAnsi="Times New Roman"/>
-          <w:b/>
           <w:bCs/>
           <w:sz w:val="20"/>
         </w:rPr>
@@ -7029,7 +6892,7 @@
       <w:pPr>
         <w:pStyle w:val="BodyText"/>
         <w:spacing w:before="0" w:after="0" w:line="240" w:lineRule="auto"/>
-        <w:jc w:val="both"/>
+        <w:jc w:val="left"/>
       </w:pPr>
       <w:r>
         <w:rPr>
@@ -7048,7 +6911,6 @@
       <w:r>
         <w:rPr>
           <w:rFonts w:ascii="Times New Roman" w:hAnsi="Times New Roman"/>
-          <w:i/>
           <w:iCs/>
           <w:sz w:val="20"/>
         </w:rPr>
@@ -7071,7 +6933,6 @@
       <w:r>
         <w:rPr>
           <w:rFonts w:ascii="Times New Roman" w:hAnsi="Times New Roman"/>
-          <w:b/>
           <w:bCs/>
           <w:sz w:val="20"/>
         </w:rPr>
@@ -7089,7 +6950,7 @@
       <w:pPr>
         <w:pStyle w:val="BodyText"/>
         <w:spacing w:before="0" w:after="0" w:line="240" w:lineRule="auto"/>
-        <w:jc w:val="both"/>
+        <w:jc w:val="left"/>
       </w:pPr>
       <w:r>
         <w:rPr>
@@ -7108,7 +6969,6 @@
       <w:r>
         <w:rPr>
           <w:rFonts w:ascii="Times New Roman" w:hAnsi="Times New Roman"/>
-          <w:i/>
           <w:iCs/>
           <w:sz w:val="20"/>
         </w:rPr>
@@ -7131,7 +6991,6 @@
       <w:r>
         <w:rPr>
           <w:rFonts w:ascii="Times New Roman" w:hAnsi="Times New Roman"/>
-          <w:b/>
           <w:bCs/>
           <w:sz w:val="20"/>
         </w:rPr>
@@ -7148,7 +7007,7 @@
     <w:p>
       <w:pPr>
         <w:spacing w:before="0" w:after="0" w:line="240" w:lineRule="auto"/>
-        <w:jc w:val="both"/>
+        <w:jc w:val="left"/>
       </w:pPr>
       <w:r>
         <w:rPr>
@@ -7164,12 +7023,11 @@
       <w:pPr>
         <w:pStyle w:val="FirstParagraph"/>
         <w:spacing w:before="0" w:after="0" w:line="240" w:lineRule="auto"/>
-        <w:jc w:val="both"/>
-      </w:pPr>
-      <w:r>
-        <w:rPr>
-          <w:rFonts w:ascii="Times New Roman" w:hAnsi="Times New Roman"/>
-          <w:i/>
+        <w:jc w:val="left"/>
+      </w:pPr>
+      <w:r>
+        <w:rPr>
+          <w:rFonts w:ascii="Times New Roman" w:hAnsi="Times New Roman"/>
           <w:iCs/>
           <w:sz w:val="20"/>
         </w:rPr>

</xml_diff>

<commit_message>
Embed system architecture PNG into final DOCX
</commit_message>
<xml_diff>
--- a/docs/ISET2026_ShadowPath_Paper_JSAER_Final.docx
+++ b/docs/ISET2026_ShadowPath_Paper_JSAER_Final.docx
@@ -2240,6 +2240,45 @@
           <w:sz w:val="20"/>
         </w:rPr>
         <w:t xml:space="preserve">                                    +----------------------+</w:t>
+      </w:r>
+    </w:p>
+    <w:p>
+      <w:pPr>
+        <w:jc w:val="center"/>
+      </w:pPr>
+      <w:r>
+        <w:drawing>
+          <wp:inline xmlns:a="http://schemas.openxmlformats.org/drawingml/2006/main" xmlns:pic="http://schemas.openxmlformats.org/drawingml/2006/picture">
+            <wp:extent cx="4572000" cy="4572000"/>
+            <wp:docPr id="1" name="Picture 1"/>
+            <wp:cNvGraphicFramePr>
+              <a:graphicFrameLocks noChangeAspect="1"/>
+            </wp:cNvGraphicFramePr>
+            <a:graphic>
+              <a:graphicData uri="http://schemas.openxmlformats.org/drawingml/2006/picture">
+                <pic:pic>
+                  <pic:nvPicPr>
+                    <pic:cNvPr id="0" name="Fig1_ShadowPath_Architecture.png"/>
+                    <pic:cNvPicPr/>
+                  </pic:nvPicPr>
+                  <pic:blipFill>
+                    <a:blip r:embed="rId19"/>
+                    <a:stretch>
+                      <a:fillRect/>
+                    </a:stretch>
+                  </pic:blipFill>
+                  <pic:spPr>
+                    <a:xfrm>
+                      <a:off x="0" y="0"/>
+                      <a:ext cx="4572000" cy="4572000"/>
+                    </a:xfrm>
+                    <a:prstGeom prst="rect"/>
+                  </pic:spPr>
+                </pic:pic>
+              </a:graphicData>
+            </a:graphic>
+          </wp:inline>
+        </w:drawing>
       </w:r>
     </w:p>
     <w:p>

</xml_diff>

<commit_message>
Remove old ASCII art from markdown and final DOCX
</commit_message>
<xml_diff>
--- a/docs/ISET2026_ShadowPath_Paper_JSAER_Final.docx
+++ b/docs/ISET2026_ShadowPath_Paper_JSAER_Final.docx
@@ -1854,396 +1854,6 @@
     </w:p>
     <w:p>
       <w:pPr>
-        <w:pStyle w:val="SourceCode"/>
-        <w:spacing w:before="0" w:after="0" w:line="240" w:lineRule="auto"/>
-        <w:jc w:val="left"/>
-      </w:pPr>
-      <w:r>
-        <w:rPr>
-          <w:rStyle w:val="VerbatimChar"/>
-          <w:rFonts w:ascii="Times New Roman" w:hAnsi="Times New Roman"/>
-          <w:sz w:val="20"/>
-        </w:rPr>
-        <w:t xml:space="preserve">+----------------------------------------------------------------------+</w:t>
-      </w:r>
-      <w:r>
-        <w:rPr>
-          <w:rFonts w:ascii="Times New Roman" w:hAnsi="Times New Roman"/>
-          <w:sz w:val="20"/>
-        </w:rPr>
-        <w:br/>
-      </w:r>
-      <w:r>
-        <w:rPr>
-          <w:rStyle w:val="VerbatimChar"/>
-          <w:rFonts w:ascii="Times New Roman" w:hAnsi="Times New Roman"/>
-          <w:sz w:val="20"/>
-        </w:rPr>
-        <w:t xml:space="preserve">|                        CLIENT APPLICATION                            |</w:t>
-      </w:r>
-      <w:r>
-        <w:rPr>
-          <w:rFonts w:ascii="Times New Roman" w:hAnsi="Times New Roman"/>
-          <w:sz w:val="20"/>
-        </w:rPr>
-        <w:br/>
-      </w:r>
-      <w:r>
-        <w:rPr>
-          <w:rStyle w:val="VerbatimChar"/>
-          <w:rFonts w:ascii="Times New Roman" w:hAnsi="Times New Roman"/>
-          <w:sz w:val="20"/>
-        </w:rPr>
-        <w:t xml:space="preserve">|   Route Search | Map + Overlays | Route Comparison | Report Button   |</w:t>
-      </w:r>
-      <w:r>
-        <w:rPr>
-          <w:rFonts w:ascii="Times New Roman" w:hAnsi="Times New Roman"/>
-          <w:sz w:val="20"/>
-        </w:rPr>
-        <w:br/>
-      </w:r>
-      <w:r>
-        <w:rPr>
-          <w:rStyle w:val="VerbatimChar"/>
-          <w:rFonts w:ascii="Times New Roman" w:hAnsi="Times New Roman"/>
-          <w:sz w:val="20"/>
-        </w:rPr>
-        <w:t xml:space="preserve">+-------------------------------+--------------------------------------+</w:t>
-      </w:r>
-      <w:r>
-        <w:rPr>
-          <w:rFonts w:ascii="Times New Roman" w:hAnsi="Times New Roman"/>
-          <w:sz w:val="20"/>
-        </w:rPr>
-        <w:br/>
-      </w:r>
-      <w:r>
-        <w:rPr>
-          <w:rStyle w:val="VerbatimChar"/>
-          <w:rFonts w:ascii="Times New Roman" w:hAnsi="Times New Roman"/>
-          <w:sz w:val="20"/>
-        </w:rPr>
-        <w:t xml:space="preserve">                                |  Route Request</w:t>
-      </w:r>
-      <w:r>
-        <w:rPr>
-          <w:rFonts w:ascii="Times New Roman" w:hAnsi="Times New Roman"/>
-          <w:sz w:val="20"/>
-        </w:rPr>
-        <w:br/>
-      </w:r>
-      <w:r>
-        <w:rPr>
-          <w:rStyle w:val="VerbatimChar"/>
-          <w:rFonts w:ascii="Times New Roman" w:hAnsi="Times New Roman"/>
-          <w:sz w:val="20"/>
-        </w:rPr>
-        <w:t xml:space="preserve">              +-----------------v--------------------+</w:t>
-      </w:r>
-      <w:r>
-        <w:rPr>
-          <w:rFonts w:ascii="Times New Roman" w:hAnsi="Times New Roman"/>
-          <w:sz w:val="20"/>
-        </w:rPr>
-        <w:br/>
-      </w:r>
-      <w:r>
-        <w:rPr>
-          <w:rStyle w:val="VerbatimChar"/>
-          <w:rFonts w:ascii="Times New Roman" w:hAnsi="Times New Roman"/>
-          <w:sz w:val="20"/>
-        </w:rPr>
-        <w:t xml:space="preserve">              |          SAFETY SCORING API          |</w:t>
-      </w:r>
-      <w:r>
-        <w:rPr>
-          <w:rFonts w:ascii="Times New Roman" w:hAnsi="Times New Roman"/>
-          <w:sz w:val="20"/>
-        </w:rPr>
-        <w:br/>
-      </w:r>
-      <w:r>
-        <w:rPr>
-          <w:rStyle w:val="VerbatimChar"/>
-          <w:rFonts w:ascii="Times New Roman" w:hAnsi="Times New Roman"/>
-          <w:sz w:val="20"/>
-        </w:rPr>
-        <w:t xml:space="preserve">              |   Segment scoring . Route ranking    |</w:t>
-      </w:r>
-      <w:r>
-        <w:rPr>
-          <w:rFonts w:ascii="Times New Roman" w:hAnsi="Times New Roman"/>
-          <w:sz w:val="20"/>
-        </w:rPr>
-        <w:br/>
-      </w:r>
-      <w:r>
-        <w:rPr>
-          <w:rStyle w:val="VerbatimChar"/>
-          <w:rFonts w:ascii="Times New Roman" w:hAnsi="Times New Roman"/>
-          <w:sz w:val="20"/>
-        </w:rPr>
-        <w:t xml:space="preserve">              +--------+--------------------+--------+</w:t>
-      </w:r>
-      <w:r>
-        <w:rPr>
-          <w:rFonts w:ascii="Times New Roman" w:hAnsi="Times New Roman"/>
-          <w:sz w:val="20"/>
-        </w:rPr>
-        <w:br/>
-      </w:r>
-      <w:r>
-        <w:rPr>
-          <w:rStyle w:val="VerbatimChar"/>
-          <w:rFonts w:ascii="Times New Roman" w:hAnsi="Times New Roman"/>
-          <w:sz w:val="20"/>
-        </w:rPr>
-        <w:t xml:space="preserve">                       |                   |</w:t>
-      </w:r>
-      <w:r>
-        <w:rPr>
-          <w:rFonts w:ascii="Times New Roman" w:hAnsi="Times New Roman"/>
-          <w:sz w:val="20"/>
-        </w:rPr>
-        <w:br/>
-      </w:r>
-      <w:r>
-        <w:rPr>
-          <w:rStyle w:val="VerbatimChar"/>
-          <w:rFonts w:ascii="Times New Roman" w:hAnsi="Times New Roman"/>
-          <w:sz w:val="20"/>
-        </w:rPr>
-        <w:t xml:space="preserve">          +------------v---------+  +------v--------------+</w:t>
-      </w:r>
-      <w:r>
-        <w:rPr>
-          <w:rFonts w:ascii="Times New Roman" w:hAnsi="Times New Roman"/>
-          <w:sz w:val="20"/>
-        </w:rPr>
-        <w:br/>
-      </w:r>
-      <w:r>
-        <w:rPr>
-          <w:rStyle w:val="VerbatimChar"/>
-          <w:rFonts w:ascii="Times New Roman" w:hAnsi="Times New Roman"/>
-          <w:sz w:val="20"/>
-        </w:rPr>
-        <w:t xml:space="preserve">          |   ROUTING ENGINE     |  |  GEOSPATIAL DATABASE |</w:t>
-      </w:r>
-      <w:r>
-        <w:rPr>
-          <w:rFonts w:ascii="Times New Roman" w:hAnsi="Times New Roman"/>
-          <w:sz w:val="20"/>
-        </w:rPr>
-        <w:br/>
-      </w:r>
-      <w:r>
-        <w:rPr>
-          <w:rStyle w:val="VerbatimChar"/>
-          <w:rFonts w:ascii="Times New Roman" w:hAnsi="Times New Roman"/>
-          <w:sz w:val="20"/>
-        </w:rPr>
-        <w:t xml:space="preserve">          |  (OSRM / Valhalla)   |  |  (PostGIS)           |</w:t>
-      </w:r>
-      <w:r>
-        <w:rPr>
-          <w:rFonts w:ascii="Times New Roman" w:hAnsi="Times New Roman"/>
-          <w:sz w:val="20"/>
-        </w:rPr>
-        <w:br/>
-      </w:r>
-      <w:r>
-        <w:rPr>
-          <w:rStyle w:val="VerbatimChar"/>
-          <w:rFonts w:ascii="Times New Roman" w:hAnsi="Times New Roman"/>
-          <w:sz w:val="20"/>
-        </w:rPr>
-        <w:t xml:space="preserve">          +----------------------+  |  OSM ways            |</w:t>
-      </w:r>
-      <w:r>
-        <w:rPr>
-          <w:rFonts w:ascii="Times New Roman" w:hAnsi="Times New Roman"/>
-          <w:sz w:val="20"/>
-        </w:rPr>
-        <w:br/>
-      </w:r>
-      <w:r>
-        <w:rPr>
-          <w:rStyle w:val="VerbatimChar"/>
-          <w:rFonts w:ascii="Times New Roman" w:hAnsi="Times New Roman"/>
-          <w:sz w:val="20"/>
-        </w:rPr>
-        <w:t xml:space="preserve">                                    |  Streetlight points  |</w:t>
-      </w:r>
-      <w:r>
-        <w:rPr>
-          <w:rFonts w:ascii="Times New Roman" w:hAnsi="Times New Roman"/>
-          <w:sz w:val="20"/>
-        </w:rPr>
-        <w:br/>
-      </w:r>
-      <w:r>
-        <w:rPr>
-          <w:rStyle w:val="VerbatimChar"/>
-          <w:rFonts w:ascii="Times New Roman" w:hAnsi="Times New Roman"/>
-          <w:sz w:val="20"/>
-        </w:rPr>
-        <w:t xml:space="preserve">                                    |  POI / Business data |</w:t>
-      </w:r>
-      <w:r>
-        <w:rPr>
-          <w:rFonts w:ascii="Times New Roman" w:hAnsi="Times New Roman"/>
-          <w:sz w:val="20"/>
-        </w:rPr>
-        <w:br/>
-      </w:r>
-      <w:r>
-        <w:rPr>
-          <w:rStyle w:val="VerbatimChar"/>
-          <w:rFonts w:ascii="Times New Roman" w:hAnsi="Times New Roman"/>
-          <w:sz w:val="20"/>
-        </w:rPr>
-        <w:t xml:space="preserve">                                    |  Civic nodes         |</w:t>
-      </w:r>
-      <w:r>
-        <w:rPr>
-          <w:rFonts w:ascii="Times New Roman" w:hAnsi="Times New Roman"/>
-          <w:sz w:val="20"/>
-        </w:rPr>
-        <w:br/>
-      </w:r>
-      <w:r>
-        <w:rPr>
-          <w:rStyle w:val="VerbatimChar"/>
-          <w:rFonts w:ascii="Times New Roman" w:hAnsi="Times New Roman"/>
-          <w:sz w:val="20"/>
-        </w:rPr>
-        <w:t xml:space="preserve">                                    |  User reports        |</w:t>
-      </w:r>
-      <w:r>
-        <w:rPr>
-          <w:rFonts w:ascii="Times New Roman" w:hAnsi="Times New Roman"/>
-          <w:sz w:val="20"/>
-        </w:rPr>
-        <w:br/>
-      </w:r>
-      <w:r>
-        <w:rPr>
-          <w:rStyle w:val="VerbatimChar"/>
-          <w:rFonts w:ascii="Times New Roman" w:hAnsi="Times New Roman"/>
-          <w:sz w:val="20"/>
-        </w:rPr>
-        <w:t xml:space="preserve">                                    +--------+-------------+</w:t>
-      </w:r>
-      <w:r>
-        <w:rPr>
-          <w:rFonts w:ascii="Times New Roman" w:hAnsi="Times New Roman"/>
-          <w:sz w:val="20"/>
-        </w:rPr>
-        <w:br/>
-      </w:r>
-      <w:r>
-        <w:rPr>
-          <w:rStyle w:val="VerbatimChar"/>
-          <w:rFonts w:ascii="Times New Roman" w:hAnsi="Times New Roman"/>
-          <w:sz w:val="20"/>
-        </w:rPr>
-        <w:t xml:space="preserve">                                             |  Ingested by</w:t>
-      </w:r>
-      <w:r>
-        <w:rPr>
-          <w:rFonts w:ascii="Times New Roman" w:hAnsi="Times New Roman"/>
-          <w:sz w:val="20"/>
-        </w:rPr>
-        <w:br/>
-      </w:r>
-      <w:r>
-        <w:rPr>
-          <w:rStyle w:val="VerbatimChar"/>
-          <w:rFonts w:ascii="Times New Roman" w:hAnsi="Times New Roman"/>
-          <w:sz w:val="20"/>
-        </w:rPr>
-        <w:t xml:space="preserve">                                    +--------v-------------+</w:t>
-      </w:r>
-      <w:r>
-        <w:rPr>
-          <w:rFonts w:ascii="Times New Roman" w:hAnsi="Times New Roman"/>
-          <w:sz w:val="20"/>
-        </w:rPr>
-        <w:br/>
-      </w:r>
-      <w:r>
-        <w:rPr>
-          <w:rStyle w:val="VerbatimChar"/>
-          <w:rFonts w:ascii="Times New Roman" w:hAnsi="Times New Roman"/>
-          <w:sz w:val="20"/>
-        </w:rPr>
-        <w:t xml:space="preserve">                                    |    ETL PIPELINE      |</w:t>
-      </w:r>
-      <w:r>
-        <w:rPr>
-          <w:rFonts w:ascii="Times New Roman" w:hAnsi="Times New Roman"/>
-          <w:sz w:val="20"/>
-        </w:rPr>
-        <w:br/>
-      </w:r>
-      <w:r>
-        <w:rPr>
-          <w:rStyle w:val="VerbatimChar"/>
-          <w:rFonts w:ascii="Times New Roman" w:hAnsi="Times New Roman"/>
-          <w:sz w:val="20"/>
-        </w:rPr>
-        <w:t xml:space="preserve">                                    |  OSM extracts        |</w:t>
-      </w:r>
-      <w:r>
-        <w:rPr>
-          <w:rFonts w:ascii="Times New Roman" w:hAnsi="Times New Roman"/>
-          <w:sz w:val="20"/>
-        </w:rPr>
-        <w:br/>
-      </w:r>
-      <w:r>
-        <w:rPr>
-          <w:rStyle w:val="VerbatimChar"/>
-          <w:rFonts w:ascii="Times New Roman" w:hAnsi="Times New Roman"/>
-          <w:sz w:val="20"/>
-        </w:rPr>
-        <w:t xml:space="preserve">                                    |  Municipal open data |</w:t>
-      </w:r>
-      <w:r>
-        <w:rPr>
-          <w:rFonts w:ascii="Times New Roman" w:hAnsi="Times New Roman"/>
-          <w:sz w:val="20"/>
-        </w:rPr>
-        <w:br/>
-      </w:r>
-      <w:r>
-        <w:rPr>
-          <w:rStyle w:val="VerbatimChar"/>
-          <w:rFonts w:ascii="Times New Roman" w:hAnsi="Times New Roman"/>
-          <w:sz w:val="20"/>
-        </w:rPr>
-        <w:t xml:space="preserve">                                    |  Government datasets |</w:t>
-      </w:r>
-      <w:r>
-        <w:rPr>
-          <w:rFonts w:ascii="Times New Roman" w:hAnsi="Times New Roman"/>
-          <w:sz w:val="20"/>
-        </w:rPr>
-        <w:br/>
-      </w:r>
-      <w:r>
-        <w:rPr>
-          <w:rStyle w:val="VerbatimChar"/>
-          <w:rFonts w:ascii="Times New Roman" w:hAnsi="Times New Roman"/>
-          <w:sz w:val="20"/>
-        </w:rPr>
-        <w:t xml:space="preserve">                                    +----------------------+</w:t>
-      </w:r>
-    </w:p>
-    <w:p>
-      <w:pPr>
         <w:jc w:val="center"/>
       </w:pPr>
       <w:r>
@@ -2283,7 +1893,7 @@
     </w:p>
     <w:p>
       <w:pPr>
-        <w:pStyle w:val="FirstParagraph"/>
+        <w:pStyle w:val="BodyText"/>
         <w:spacing w:before="0" w:after="0" w:line="240" w:lineRule="auto"/>
         <w:jc w:val="left"/>
       </w:pPr>

</xml_diff>